<commit_message>
added captions in figures
</commit_message>
<xml_diff>
--- a/Report/Task7_JobScheduling_Report.docx
+++ b/Report/Task7_JobScheduling_Report.docx
@@ -4,6 +4,9 @@
   <w:body>
     <w:p>
       <w:pPr>
+        <w:tabs>
+          <w:tab w:val="left" w:pos="2592"/>
+        </w:tabs>
         <w:sectPr>
           <w:pgSz w:w="11906" w:h="16838"/>
           <w:pgMar w:top="1440" w:right="1440" w:bottom="1440" w:left="1440" w:header="708" w:footer="708" w:gutter="0"/>
@@ -18,16 +21,7 @@
       </w:pPr>
       <w:r>
         <w:lastRenderedPageBreak/>
-        <w:t>Task #</w:t>
-      </w:r>
-      <w:r>
-        <w:t>7</w:t>
-      </w:r>
-      <w:r>
-        <w:t xml:space="preserve"> – </w:t>
-      </w:r>
-      <w:r>
-        <w:t>Job Scheduling</w:t>
+        <w:t>Task #7 – Job Scheduling</w:t>
       </w:r>
     </w:p>
     <w:p>
@@ -5580,12 +5574,6 @@
         <w:gridCol w:w="1535"/>
       </w:tblGrid>
       <w:tr>
-        <w:tblPrEx>
-          <w:tblCellMar>
-            <w:top w:w="0" w:type="dxa"/>
-            <w:bottom w:w="0" w:type="dxa"/>
-          </w:tblCellMar>
-        </w:tblPrEx>
         <w:trPr>
           <w:tblHeader/>
         </w:trPr>
@@ -5761,12 +5749,6 @@
         </w:tc>
       </w:tr>
       <w:tr>
-        <w:tblPrEx>
-          <w:tblCellMar>
-            <w:top w:w="0" w:type="dxa"/>
-            <w:bottom w:w="0" w:type="dxa"/>
-          </w:tblCellMar>
-        </w:tblPrEx>
         <w:tc>
           <w:tcPr>
             <w:tcW w:w="1353" w:type="dxa"/>
@@ -5924,12 +5906,6 @@
         </w:tc>
       </w:tr>
       <w:tr>
-        <w:tblPrEx>
-          <w:tblCellMar>
-            <w:top w:w="0" w:type="dxa"/>
-            <w:bottom w:w="0" w:type="dxa"/>
-          </w:tblCellMar>
-        </w:tblPrEx>
         <w:tc>
           <w:tcPr>
             <w:tcW w:w="1353" w:type="dxa"/>
@@ -6087,12 +6063,6 @@
         </w:tc>
       </w:tr>
       <w:tr>
-        <w:tblPrEx>
-          <w:tblCellMar>
-            <w:top w:w="0" w:type="dxa"/>
-            <w:bottom w:w="0" w:type="dxa"/>
-          </w:tblCellMar>
-        </w:tblPrEx>
         <w:tc>
           <w:tcPr>
             <w:tcW w:w="1353" w:type="dxa"/>
@@ -6370,10 +6340,14 @@
     </w:p>
     <w:p>
       <w:pPr>
+        <w:keepNext/>
         <w:spacing w:before="120" w:after="60" w:line="276" w:lineRule="auto"/>
         <w:jc w:val="both"/>
       </w:pPr>
       <w:r>
+        <w:rPr>
+          <w:noProof/>
+        </w:rPr>
         <w:drawing>
           <wp:inline distT="0" distB="0" distL="0" distR="0" wp14:anchorId="33DE47F1" wp14:editId="0E1061E8">
             <wp:extent cx="5731510" cy="1235710"/>
@@ -6390,7 +6364,7 @@
                     <pic:cNvPicPr/>
                   </pic:nvPicPr>
                   <pic:blipFill>
-                    <a:blip r:embed="rId7"/>
+                    <a:blip r:embed="rId8"/>
                     <a:stretch>
                       <a:fillRect/>
                     </a:stretch>
@@ -6409,6 +6383,66 @@
             </a:graphic>
           </wp:inline>
         </w:drawing>
+      </w:r>
+    </w:p>
+    <w:p>
+      <w:pPr>
+        <w:pStyle w:val="Caption"/>
+        <w:jc w:val="center"/>
+        <w:rPr>
+          <w:sz w:val="20"/>
+          <w:szCs w:val="20"/>
+        </w:rPr>
+      </w:pPr>
+      <w:r>
+        <w:rPr>
+          <w:sz w:val="20"/>
+          <w:szCs w:val="20"/>
+        </w:rPr>
+        <w:t xml:space="preserve">Task 7:  </w:t>
+      </w:r>
+      <w:r>
+        <w:rPr>
+          <w:sz w:val="20"/>
+          <w:szCs w:val="20"/>
+        </w:rPr>
+        <w:fldChar w:fldCharType="begin"/>
+      </w:r>
+      <w:r>
+        <w:rPr>
+          <w:sz w:val="20"/>
+          <w:szCs w:val="20"/>
+        </w:rPr>
+        <w:instrText xml:space="preserve"> SEQ Task_7:_ \* ARABIC </w:instrText>
+      </w:r>
+      <w:r>
+        <w:rPr>
+          <w:sz w:val="20"/>
+          <w:szCs w:val="20"/>
+        </w:rPr>
+        <w:fldChar w:fldCharType="separate"/>
+      </w:r>
+      <w:r>
+        <w:rPr>
+          <w:noProof/>
+          <w:sz w:val="20"/>
+          <w:szCs w:val="20"/>
+        </w:rPr>
+        <w:t>1</w:t>
+      </w:r>
+      <w:r>
+        <w:rPr>
+          <w:sz w:val="20"/>
+          <w:szCs w:val="20"/>
+        </w:rPr>
+        <w:fldChar w:fldCharType="end"/>
+      </w:r>
+      <w:r>
+        <w:rPr>
+          <w:sz w:val="20"/>
+          <w:szCs w:val="20"/>
+        </w:rPr>
+        <w:t xml:space="preserve"> Brute Force - 1st Test Case</w:t>
       </w:r>
     </w:p>
     <w:p>
@@ -6475,12 +6509,6 @@
         <w:gridCol w:w="1535"/>
       </w:tblGrid>
       <w:tr>
-        <w:tblPrEx>
-          <w:tblCellMar>
-            <w:top w:w="0" w:type="dxa"/>
-            <w:bottom w:w="0" w:type="dxa"/>
-          </w:tblCellMar>
-        </w:tblPrEx>
         <w:trPr>
           <w:tblHeader/>
         </w:trPr>
@@ -6656,12 +6684,6 @@
         </w:tc>
       </w:tr>
       <w:tr>
-        <w:tblPrEx>
-          <w:tblCellMar>
-            <w:top w:w="0" w:type="dxa"/>
-            <w:bottom w:w="0" w:type="dxa"/>
-          </w:tblCellMar>
-        </w:tblPrEx>
         <w:tc>
           <w:tcPr>
             <w:tcW w:w="1353" w:type="dxa"/>
@@ -6819,12 +6841,6 @@
         </w:tc>
       </w:tr>
       <w:tr>
-        <w:tblPrEx>
-          <w:tblCellMar>
-            <w:top w:w="0" w:type="dxa"/>
-            <w:bottom w:w="0" w:type="dxa"/>
-          </w:tblCellMar>
-        </w:tblPrEx>
         <w:tc>
           <w:tcPr>
             <w:tcW w:w="1353" w:type="dxa"/>
@@ -6982,12 +6998,6 @@
         </w:tc>
       </w:tr>
       <w:tr>
-        <w:tblPrEx>
-          <w:tblCellMar>
-            <w:top w:w="0" w:type="dxa"/>
-            <w:bottom w:w="0" w:type="dxa"/>
-          </w:tblCellMar>
-        </w:tblPrEx>
         <w:tc>
           <w:tcPr>
             <w:tcW w:w="1353" w:type="dxa"/>
@@ -7156,6 +7166,7 @@
         <w:jc w:val="both"/>
       </w:pPr>
       <w:r>
+        <w:lastRenderedPageBreak/>
         <w:t>Cumulative times (1, 3, 6) all fall within deadlines (5, 10, 15). Total Penalty = 0.</w:t>
       </w:r>
     </w:p>
@@ -7173,16 +7184,19 @@
           <w:b/>
           <w:bCs/>
         </w:rPr>
-        <w:lastRenderedPageBreak/>
         <w:t>Output:</w:t>
       </w:r>
     </w:p>
     <w:p>
       <w:pPr>
+        <w:keepNext/>
         <w:spacing w:before="120" w:after="60" w:line="276" w:lineRule="auto"/>
         <w:jc w:val="both"/>
       </w:pPr>
       <w:r>
+        <w:rPr>
+          <w:noProof/>
+        </w:rPr>
         <w:drawing>
           <wp:inline distT="0" distB="0" distL="0" distR="0" wp14:anchorId="20962BF1" wp14:editId="189C620D">
             <wp:extent cx="5731510" cy="1608455"/>
@@ -7199,7 +7213,7 @@
                     <pic:cNvPicPr/>
                   </pic:nvPicPr>
                   <pic:blipFill>
-                    <a:blip r:embed="rId8"/>
+                    <a:blip r:embed="rId9"/>
                     <a:stretch>
                       <a:fillRect/>
                     </a:stretch>
@@ -7218,6 +7232,66 @@
             </a:graphic>
           </wp:inline>
         </w:drawing>
+      </w:r>
+    </w:p>
+    <w:p>
+      <w:pPr>
+        <w:pStyle w:val="Caption"/>
+        <w:jc w:val="center"/>
+        <w:rPr>
+          <w:sz w:val="20"/>
+          <w:szCs w:val="20"/>
+        </w:rPr>
+      </w:pPr>
+      <w:r>
+        <w:rPr>
+          <w:sz w:val="20"/>
+          <w:szCs w:val="20"/>
+        </w:rPr>
+        <w:t xml:space="preserve">Task 7:  </w:t>
+      </w:r>
+      <w:r>
+        <w:rPr>
+          <w:sz w:val="20"/>
+          <w:szCs w:val="20"/>
+        </w:rPr>
+        <w:fldChar w:fldCharType="begin"/>
+      </w:r>
+      <w:r>
+        <w:rPr>
+          <w:sz w:val="20"/>
+          <w:szCs w:val="20"/>
+        </w:rPr>
+        <w:instrText xml:space="preserve"> SEQ Task_7:_ \* ARABIC </w:instrText>
+      </w:r>
+      <w:r>
+        <w:rPr>
+          <w:sz w:val="20"/>
+          <w:szCs w:val="20"/>
+        </w:rPr>
+        <w:fldChar w:fldCharType="separate"/>
+      </w:r>
+      <w:r>
+        <w:rPr>
+          <w:noProof/>
+          <w:sz w:val="20"/>
+          <w:szCs w:val="20"/>
+        </w:rPr>
+        <w:t>2</w:t>
+      </w:r>
+      <w:r>
+        <w:rPr>
+          <w:sz w:val="20"/>
+          <w:szCs w:val="20"/>
+        </w:rPr>
+        <w:fldChar w:fldCharType="end"/>
+      </w:r>
+      <w:r>
+        <w:rPr>
+          <w:sz w:val="20"/>
+          <w:szCs w:val="20"/>
+        </w:rPr>
+        <w:t xml:space="preserve">  Brute Force - 2nd Test Case</w:t>
       </w:r>
     </w:p>
     <w:p>
@@ -7281,12 +7355,6 @@
         <w:gridCol w:w="6770"/>
       </w:tblGrid>
       <w:tr>
-        <w:tblPrEx>
-          <w:tblCellMar>
-            <w:top w:w="0" w:type="dxa"/>
-            <w:bottom w:w="0" w:type="dxa"/>
-          </w:tblCellMar>
-        </w:tblPrEx>
         <w:trPr>
           <w:tblHeader/>
         </w:trPr>
@@ -7360,12 +7428,6 @@
         </w:tc>
       </w:tr>
       <w:tr>
-        <w:tblPrEx>
-          <w:tblCellMar>
-            <w:top w:w="0" w:type="dxa"/>
-            <w:bottom w:w="0" w:type="dxa"/>
-          </w:tblCellMar>
-        </w:tblPrEx>
         <w:tc>
           <w:tcPr>
             <w:tcW w:w="2256" w:type="dxa"/>
@@ -7455,12 +7517,6 @@
         </w:tc>
       </w:tr>
       <w:tr>
-        <w:tblPrEx>
-          <w:tblCellMar>
-            <w:top w:w="0" w:type="dxa"/>
-            <w:bottom w:w="0" w:type="dxa"/>
-          </w:tblCellMar>
-        </w:tblPrEx>
         <w:tc>
           <w:tcPr>
             <w:tcW w:w="2256" w:type="dxa"/>
@@ -7755,21 +7811,16 @@
         <w:jc w:val="both"/>
       </w:pPr>
       <w:r>
+        <w:lastRenderedPageBreak/>
         <w:t>Output the sorted job order and total minimum penalty.</w:t>
       </w:r>
     </w:p>
     <w:p>
-      <w:r>
-        <w:br w:type="page"/>
-      </w:r>
-    </w:p>
-    <w:p>
       <w:pPr>
         <w:pStyle w:val="Heading2"/>
       </w:pPr>
       <w:proofErr w:type="gramStart"/>
       <w:r>
-        <w:lastRenderedPageBreak/>
         <w:t>4.3  Pseudocode</w:t>
       </w:r>
       <w:proofErr w:type="gramEnd"/>
@@ -9669,7 +9720,6 @@
           <w:rFonts w:eastAsia="Times New Roman"/>
           <w:color w:val="569CD6"/>
         </w:rPr>
-        <w:lastRenderedPageBreak/>
         <w:t>int</w:t>
       </w:r>
       <w:r>
@@ -11918,6 +11968,7 @@
           <w:rFonts w:eastAsia="Times New Roman"/>
           <w:color w:val="D4D4D4"/>
         </w:rPr>
+        <w:lastRenderedPageBreak/>
         <w:t>    }</w:t>
       </w:r>
     </w:p>
@@ -11935,7 +11986,6 @@
           <w:rFonts w:eastAsia="Times New Roman"/>
           <w:color w:val="D4D4D4"/>
         </w:rPr>
-        <w:lastRenderedPageBreak/>
         <w:t xml:space="preserve">    </w:t>
       </w:r>
       <w:r>
@@ -13838,6 +13888,7 @@
           <w:rFonts w:eastAsia="Times New Roman"/>
           <w:color w:val="D4D4D4"/>
         </w:rPr>
+        <w:lastRenderedPageBreak/>
         <w:t xml:space="preserve">        </w:t>
       </w:r>
       <w:r>
@@ -13934,7 +13985,6 @@
           <w:rFonts w:eastAsia="Times New Roman"/>
           <w:color w:val="D4D4D4"/>
         </w:rPr>
-        <w:lastRenderedPageBreak/>
         <w:t xml:space="preserve">            </w:t>
       </w:r>
       <w:proofErr w:type="spellStart"/>
@@ -14827,12 +14877,6 @@
         <w:gridCol w:w="1535"/>
       </w:tblGrid>
       <w:tr>
-        <w:tblPrEx>
-          <w:tblCellMar>
-            <w:top w:w="0" w:type="dxa"/>
-            <w:bottom w:w="0" w:type="dxa"/>
-          </w:tblCellMar>
-        </w:tblPrEx>
         <w:trPr>
           <w:tblHeader/>
         </w:trPr>
@@ -15008,12 +15052,6 @@
         </w:tc>
       </w:tr>
       <w:tr>
-        <w:tblPrEx>
-          <w:tblCellMar>
-            <w:top w:w="0" w:type="dxa"/>
-            <w:bottom w:w="0" w:type="dxa"/>
-          </w:tblCellMar>
-        </w:tblPrEx>
         <w:tc>
           <w:tcPr>
             <w:tcW w:w="1353" w:type="dxa"/>
@@ -15171,12 +15209,6 @@
         </w:tc>
       </w:tr>
       <w:tr>
-        <w:tblPrEx>
-          <w:tblCellMar>
-            <w:top w:w="0" w:type="dxa"/>
-            <w:bottom w:w="0" w:type="dxa"/>
-          </w:tblCellMar>
-        </w:tblPrEx>
         <w:tc>
           <w:tcPr>
             <w:tcW w:w="1353" w:type="dxa"/>
@@ -15334,12 +15366,6 @@
         </w:tc>
       </w:tr>
       <w:tr>
-        <w:tblPrEx>
-          <w:tblCellMar>
-            <w:top w:w="0" w:type="dxa"/>
-            <w:bottom w:w="0" w:type="dxa"/>
-          </w:tblCellMar>
-        </w:tblPrEx>
         <w:tc>
           <w:tcPr>
             <w:tcW w:w="1353" w:type="dxa"/>
@@ -15617,14 +15643,19 @@
     </w:p>
     <w:p>
       <w:pPr>
+        <w:keepNext/>
         <w:spacing w:before="120" w:after="60" w:line="276" w:lineRule="auto"/>
-        <w:jc w:val="both"/>
-      </w:pPr>
-      <w:r>
+        <w:jc w:val="center"/>
+      </w:pPr>
+      <w:r>
+        <w:rPr>
+          <w:noProof/>
+        </w:rPr>
+        <w:lastRenderedPageBreak/>
         <w:drawing>
-          <wp:inline distT="0" distB="0" distL="0" distR="0" wp14:anchorId="273B68E4" wp14:editId="5E91FB29">
-            <wp:extent cx="5398966" cy="1402080"/>
-            <wp:effectExtent l="0" t="0" r="0" b="7620"/>
+          <wp:inline distT="0" distB="0" distL="0" distR="0" wp14:anchorId="273B68E4" wp14:editId="15CEE82E">
+            <wp:extent cx="4606725" cy="1196340"/>
+            <wp:effectExtent l="0" t="0" r="3810" b="3810"/>
             <wp:docPr id="571301549" name="Picture 1"/>
             <wp:cNvGraphicFramePr>
               <a:graphicFrameLocks xmlns:a="http://schemas.openxmlformats.org/drawingml/2006/main" noChangeAspect="1"/>
@@ -15637,7 +15668,7 @@
                     <pic:cNvPicPr/>
                   </pic:nvPicPr>
                   <pic:blipFill>
-                    <a:blip r:embed="rId9"/>
+                    <a:blip r:embed="rId10"/>
                     <a:stretch>
                       <a:fillRect/>
                     </a:stretch>
@@ -15645,7 +15676,7 @@
                   <pic:spPr>
                     <a:xfrm>
                       <a:off x="0" y="0"/>
-                      <a:ext cx="5417432" cy="1406875"/>
+                      <a:ext cx="4641512" cy="1205374"/>
                     </a:xfrm>
                     <a:prstGeom prst="rect">
                       <a:avLst/>
@@ -15660,6 +15691,66 @@
     </w:p>
     <w:p>
       <w:pPr>
+        <w:pStyle w:val="Caption"/>
+        <w:jc w:val="center"/>
+        <w:rPr>
+          <w:sz w:val="20"/>
+          <w:szCs w:val="20"/>
+        </w:rPr>
+      </w:pPr>
+      <w:r>
+        <w:rPr>
+          <w:sz w:val="20"/>
+          <w:szCs w:val="20"/>
+        </w:rPr>
+        <w:t xml:space="preserve">Task 7:  </w:t>
+      </w:r>
+      <w:r>
+        <w:rPr>
+          <w:sz w:val="20"/>
+          <w:szCs w:val="20"/>
+        </w:rPr>
+        <w:fldChar w:fldCharType="begin"/>
+      </w:r>
+      <w:r>
+        <w:rPr>
+          <w:sz w:val="20"/>
+          <w:szCs w:val="20"/>
+        </w:rPr>
+        <w:instrText xml:space="preserve"> SEQ Task_7:_ \* ARABIC </w:instrText>
+      </w:r>
+      <w:r>
+        <w:rPr>
+          <w:sz w:val="20"/>
+          <w:szCs w:val="20"/>
+        </w:rPr>
+        <w:fldChar w:fldCharType="separate"/>
+      </w:r>
+      <w:r>
+        <w:rPr>
+          <w:noProof/>
+          <w:sz w:val="20"/>
+          <w:szCs w:val="20"/>
+        </w:rPr>
+        <w:t>3</w:t>
+      </w:r>
+      <w:r>
+        <w:rPr>
+          <w:sz w:val="20"/>
+          <w:szCs w:val="20"/>
+        </w:rPr>
+        <w:fldChar w:fldCharType="end"/>
+      </w:r>
+      <w:r>
+        <w:rPr>
+          <w:sz w:val="20"/>
+          <w:szCs w:val="20"/>
+        </w:rPr>
+        <w:t xml:space="preserve">  Divide &amp; Conquer - 1st Test Case</w:t>
+      </w:r>
+    </w:p>
+    <w:p>
+      <w:pPr>
         <w:spacing w:before="120" w:after="60" w:line="276" w:lineRule="auto"/>
         <w:jc w:val="both"/>
       </w:pPr>
@@ -15668,7 +15759,6 @@
           <w:b/>
           <w:bCs/>
         </w:rPr>
-        <w:lastRenderedPageBreak/>
         <w:t>Test Case 2 – All Jobs Meet Deadlines (n = 3)</w:t>
       </w:r>
     </w:p>
@@ -15718,12 +15808,6 @@
         <w:gridCol w:w="1535"/>
       </w:tblGrid>
       <w:tr>
-        <w:tblPrEx>
-          <w:tblCellMar>
-            <w:top w:w="0" w:type="dxa"/>
-            <w:bottom w:w="0" w:type="dxa"/>
-          </w:tblCellMar>
-        </w:tblPrEx>
         <w:trPr>
           <w:tblHeader/>
         </w:trPr>
@@ -15899,12 +15983,6 @@
         </w:tc>
       </w:tr>
       <w:tr>
-        <w:tblPrEx>
-          <w:tblCellMar>
-            <w:top w:w="0" w:type="dxa"/>
-            <w:bottom w:w="0" w:type="dxa"/>
-          </w:tblCellMar>
-        </w:tblPrEx>
         <w:tc>
           <w:tcPr>
             <w:tcW w:w="1353" w:type="dxa"/>
@@ -16062,12 +16140,6 @@
         </w:tc>
       </w:tr>
       <w:tr>
-        <w:tblPrEx>
-          <w:tblCellMar>
-            <w:top w:w="0" w:type="dxa"/>
-            <w:bottom w:w="0" w:type="dxa"/>
-          </w:tblCellMar>
-        </w:tblPrEx>
         <w:tc>
           <w:tcPr>
             <w:tcW w:w="1353" w:type="dxa"/>
@@ -16225,12 +16297,6 @@
         </w:tc>
       </w:tr>
       <w:tr>
-        <w:tblPrEx>
-          <w:tblCellMar>
-            <w:top w:w="0" w:type="dxa"/>
-            <w:bottom w:w="0" w:type="dxa"/>
-          </w:tblCellMar>
-        </w:tblPrEx>
         <w:tc>
           <w:tcPr>
             <w:tcW w:w="1353" w:type="dxa"/>
@@ -16421,17 +16487,15 @@
     </w:p>
     <w:p>
       <w:pPr>
+        <w:keepNext/>
         <w:spacing w:before="120" w:after="60" w:line="276" w:lineRule="auto"/>
         <w:jc w:val="both"/>
+      </w:pPr>
+      <w:r>
         <w:rPr>
           <w:b/>
           <w:bCs/>
-        </w:rPr>
-      </w:pPr>
-      <w:r>
-        <w:rPr>
-          <w:b/>
-          <w:bCs/>
+          <w:noProof/>
         </w:rPr>
         <w:drawing>
           <wp:inline distT="0" distB="0" distL="0" distR="0" wp14:anchorId="03B5C902" wp14:editId="2E418BD2">
@@ -16449,7 +16513,7 @@
                     <pic:cNvPicPr/>
                   </pic:nvPicPr>
                   <pic:blipFill>
-                    <a:blip r:embed="rId10"/>
+                    <a:blip r:embed="rId11"/>
                     <a:stretch>
                       <a:fillRect/>
                     </a:stretch>
@@ -16468,6 +16532,68 @@
             </a:graphic>
           </wp:inline>
         </w:drawing>
+      </w:r>
+    </w:p>
+    <w:p>
+      <w:pPr>
+        <w:pStyle w:val="Caption"/>
+        <w:jc w:val="center"/>
+        <w:rPr>
+          <w:b/>
+          <w:bCs/>
+          <w:sz w:val="20"/>
+          <w:szCs w:val="20"/>
+        </w:rPr>
+      </w:pPr>
+      <w:r>
+        <w:rPr>
+          <w:sz w:val="20"/>
+          <w:szCs w:val="20"/>
+        </w:rPr>
+        <w:t xml:space="preserve">Task 7:  </w:t>
+      </w:r>
+      <w:r>
+        <w:rPr>
+          <w:sz w:val="20"/>
+          <w:szCs w:val="20"/>
+        </w:rPr>
+        <w:fldChar w:fldCharType="begin"/>
+      </w:r>
+      <w:r>
+        <w:rPr>
+          <w:sz w:val="20"/>
+          <w:szCs w:val="20"/>
+        </w:rPr>
+        <w:instrText xml:space="preserve"> SEQ Task_7:_ \* ARABIC </w:instrText>
+      </w:r>
+      <w:r>
+        <w:rPr>
+          <w:sz w:val="20"/>
+          <w:szCs w:val="20"/>
+        </w:rPr>
+        <w:fldChar w:fldCharType="separate"/>
+      </w:r>
+      <w:r>
+        <w:rPr>
+          <w:noProof/>
+          <w:sz w:val="20"/>
+          <w:szCs w:val="20"/>
+        </w:rPr>
+        <w:t>4</w:t>
+      </w:r>
+      <w:r>
+        <w:rPr>
+          <w:sz w:val="20"/>
+          <w:szCs w:val="20"/>
+        </w:rPr>
+        <w:fldChar w:fldCharType="end"/>
+      </w:r>
+      <w:r>
+        <w:rPr>
+          <w:sz w:val="20"/>
+          <w:szCs w:val="20"/>
+        </w:rPr>
+        <w:t xml:space="preserve">  Divide &amp; Conquer - 2nd Test Case</w:t>
       </w:r>
     </w:p>
     <w:p>
@@ -16526,12 +16652,6 @@
         <w:gridCol w:w="6770"/>
       </w:tblGrid>
       <w:tr>
-        <w:tblPrEx>
-          <w:tblCellMar>
-            <w:top w:w="0" w:type="dxa"/>
-            <w:bottom w:w="0" w:type="dxa"/>
-          </w:tblCellMar>
-        </w:tblPrEx>
         <w:trPr>
           <w:tblHeader/>
         </w:trPr>
@@ -16605,12 +16725,6 @@
         </w:tc>
       </w:tr>
       <w:tr>
-        <w:tblPrEx>
-          <w:tblCellMar>
-            <w:top w:w="0" w:type="dxa"/>
-            <w:bottom w:w="0" w:type="dxa"/>
-          </w:tblCellMar>
-        </w:tblPrEx>
         <w:tc>
           <w:tcPr>
             <w:tcW w:w="2256" w:type="dxa"/>
@@ -16700,12 +16814,6 @@
         </w:tc>
       </w:tr>
       <w:tr>
-        <w:tblPrEx>
-          <w:tblCellMar>
-            <w:top w:w="0" w:type="dxa"/>
-            <w:bottom w:w="0" w:type="dxa"/>
-          </w:tblCellMar>
-        </w:tblPrEx>
         <w:tc>
           <w:tcPr>
             <w:tcW w:w="2256" w:type="dxa"/>
@@ -16858,6 +16966,7 @@
       </w:pPr>
       <w:proofErr w:type="gramStart"/>
       <w:r>
+        <w:lastRenderedPageBreak/>
         <w:t>5.1  Methodology</w:t>
       </w:r>
       <w:proofErr w:type="gramEnd"/>
@@ -16877,7 +16986,6 @@
       </w:pPr>
       <w:proofErr w:type="gramStart"/>
       <w:r>
-        <w:lastRenderedPageBreak/>
         <w:t>5.2  Step</w:t>
       </w:r>
       <w:proofErr w:type="gramEnd"/>
@@ -18718,6 +18826,7 @@
           <w:sz w:val="18"/>
           <w:szCs w:val="18"/>
         </w:rPr>
+        <w:lastRenderedPageBreak/>
         <w:t xml:space="preserve">        </w:t>
       </w:r>
       <w:proofErr w:type="spellStart"/>
@@ -18961,7 +19070,6 @@
           <w:rFonts w:eastAsia="Times New Roman"/>
           <w:color w:val="C586C0"/>
         </w:rPr>
-        <w:lastRenderedPageBreak/>
         <w:t>#include</w:t>
       </w:r>
       <w:proofErr w:type="gramEnd"/>
@@ -20792,6 +20900,7 @@
           <w:rFonts w:eastAsia="Times New Roman"/>
           <w:color w:val="D4D4D4"/>
         </w:rPr>
+        <w:lastRenderedPageBreak/>
         <w:t xml:space="preserve">            </w:t>
       </w:r>
       <w:r>
@@ -21046,7 +21155,6 @@
           <w:rFonts w:eastAsia="Times New Roman"/>
           <w:color w:val="D4D4D4"/>
         </w:rPr>
-        <w:lastRenderedPageBreak/>
         <w:t xml:space="preserve">                </w:t>
       </w:r>
       <w:r>
@@ -22461,6 +22569,7 @@
           <w:rFonts w:eastAsia="Times New Roman"/>
           <w:color w:val="D4D4D4"/>
         </w:rPr>
+        <w:lastRenderedPageBreak/>
         <w:t>    }</w:t>
       </w:r>
     </w:p>
@@ -22802,7 +22911,6 @@
           <w:rFonts w:eastAsia="Times New Roman"/>
           <w:color w:val="D4D4D4"/>
         </w:rPr>
-        <w:lastRenderedPageBreak/>
         <w:t>    {</w:t>
       </w:r>
     </w:p>
@@ -24012,12 +24120,6 @@
         <w:gridCol w:w="1535"/>
       </w:tblGrid>
       <w:tr>
-        <w:tblPrEx>
-          <w:tblCellMar>
-            <w:top w:w="0" w:type="dxa"/>
-            <w:bottom w:w="0" w:type="dxa"/>
-          </w:tblCellMar>
-        </w:tblPrEx>
         <w:trPr>
           <w:tblHeader/>
         </w:trPr>
@@ -24193,12 +24295,6 @@
         </w:tc>
       </w:tr>
       <w:tr>
-        <w:tblPrEx>
-          <w:tblCellMar>
-            <w:top w:w="0" w:type="dxa"/>
-            <w:bottom w:w="0" w:type="dxa"/>
-          </w:tblCellMar>
-        </w:tblPrEx>
         <w:tc>
           <w:tcPr>
             <w:tcW w:w="1353" w:type="dxa"/>
@@ -24356,12 +24452,6 @@
         </w:tc>
       </w:tr>
       <w:tr>
-        <w:tblPrEx>
-          <w:tblCellMar>
-            <w:top w:w="0" w:type="dxa"/>
-            <w:bottom w:w="0" w:type="dxa"/>
-          </w:tblCellMar>
-        </w:tblPrEx>
         <w:tc>
           <w:tcPr>
             <w:tcW w:w="1353" w:type="dxa"/>
@@ -24519,12 +24609,6 @@
         </w:tc>
       </w:tr>
       <w:tr>
-        <w:tblPrEx>
-          <w:tblCellMar>
-            <w:top w:w="0" w:type="dxa"/>
-            <w:bottom w:w="0" w:type="dxa"/>
-          </w:tblCellMar>
-        </w:tblPrEx>
         <w:tc>
           <w:tcPr>
             <w:tcW w:w="1353" w:type="dxa"/>
@@ -24698,6 +24782,7 @@
         <w:jc w:val="both"/>
       </w:pPr>
       <w:r>
+        <w:lastRenderedPageBreak/>
         <w:t xml:space="preserve">Job 3: cumulative time = 1 ≤ </w:t>
       </w:r>
       <w:proofErr w:type="gramStart"/>
@@ -24789,6 +24874,7 @@
     </w:p>
     <w:p>
       <w:pPr>
+        <w:keepNext/>
         <w:spacing w:before="120" w:after="60" w:line="276" w:lineRule="auto"/>
         <w:jc w:val="both"/>
       </w:pPr>
@@ -24796,7 +24882,6 @@
         <w:rPr>
           <w:noProof/>
         </w:rPr>
-        <w:lastRenderedPageBreak/>
         <w:drawing>
           <wp:inline distT="0" distB="0" distL="0" distR="0" wp14:anchorId="6354D122" wp14:editId="16D8BC45">
             <wp:extent cx="5731510" cy="1807845"/>
@@ -24813,7 +24898,7 @@
                     <pic:cNvPicPr/>
                   </pic:nvPicPr>
                   <pic:blipFill>
-                    <a:blip r:embed="rId11"/>
+                    <a:blip r:embed="rId12"/>
                     <a:stretch>
                       <a:fillRect/>
                     </a:stretch>
@@ -24832,6 +24917,66 @@
             </a:graphic>
           </wp:inline>
         </w:drawing>
+      </w:r>
+    </w:p>
+    <w:p>
+      <w:pPr>
+        <w:pStyle w:val="Caption"/>
+        <w:jc w:val="center"/>
+        <w:rPr>
+          <w:sz w:val="20"/>
+          <w:szCs w:val="20"/>
+        </w:rPr>
+      </w:pPr>
+      <w:r>
+        <w:rPr>
+          <w:sz w:val="20"/>
+          <w:szCs w:val="20"/>
+        </w:rPr>
+        <w:t xml:space="preserve">Task 7:  </w:t>
+      </w:r>
+      <w:r>
+        <w:rPr>
+          <w:sz w:val="20"/>
+          <w:szCs w:val="20"/>
+        </w:rPr>
+        <w:fldChar w:fldCharType="begin"/>
+      </w:r>
+      <w:r>
+        <w:rPr>
+          <w:sz w:val="20"/>
+          <w:szCs w:val="20"/>
+        </w:rPr>
+        <w:instrText xml:space="preserve"> SEQ Task_7:_ \* ARABIC </w:instrText>
+      </w:r>
+      <w:r>
+        <w:rPr>
+          <w:sz w:val="20"/>
+          <w:szCs w:val="20"/>
+        </w:rPr>
+        <w:fldChar w:fldCharType="separate"/>
+      </w:r>
+      <w:r>
+        <w:rPr>
+          <w:noProof/>
+          <w:sz w:val="20"/>
+          <w:szCs w:val="20"/>
+        </w:rPr>
+        <w:t>5</w:t>
+      </w:r>
+      <w:r>
+        <w:rPr>
+          <w:sz w:val="20"/>
+          <w:szCs w:val="20"/>
+        </w:rPr>
+        <w:fldChar w:fldCharType="end"/>
+      </w:r>
+      <w:r>
+        <w:rPr>
+          <w:sz w:val="20"/>
+          <w:szCs w:val="20"/>
+        </w:rPr>
+        <w:t xml:space="preserve"> Dynamic Programming - 1st Test Case</w:t>
       </w:r>
     </w:p>
     <w:p>
@@ -24898,12 +25043,6 @@
         <w:gridCol w:w="1535"/>
       </w:tblGrid>
       <w:tr>
-        <w:tblPrEx>
-          <w:tblCellMar>
-            <w:top w:w="0" w:type="dxa"/>
-            <w:bottom w:w="0" w:type="dxa"/>
-          </w:tblCellMar>
-        </w:tblPrEx>
         <w:trPr>
           <w:tblHeader/>
         </w:trPr>
@@ -25079,12 +25218,6 @@
         </w:tc>
       </w:tr>
       <w:tr>
-        <w:tblPrEx>
-          <w:tblCellMar>
-            <w:top w:w="0" w:type="dxa"/>
-            <w:bottom w:w="0" w:type="dxa"/>
-          </w:tblCellMar>
-        </w:tblPrEx>
         <w:tc>
           <w:tcPr>
             <w:tcW w:w="1353" w:type="dxa"/>
@@ -25242,12 +25375,6 @@
         </w:tc>
       </w:tr>
       <w:tr>
-        <w:tblPrEx>
-          <w:tblCellMar>
-            <w:top w:w="0" w:type="dxa"/>
-            <w:bottom w:w="0" w:type="dxa"/>
-          </w:tblCellMar>
-        </w:tblPrEx>
         <w:tc>
           <w:tcPr>
             <w:tcW w:w="1353" w:type="dxa"/>
@@ -25405,12 +25532,6 @@
         </w:tc>
       </w:tr>
       <w:tr>
-        <w:tblPrEx>
-          <w:tblCellMar>
-            <w:top w:w="0" w:type="dxa"/>
-            <w:bottom w:w="0" w:type="dxa"/>
-          </w:tblCellMar>
-        </w:tblPrEx>
         <w:tc>
           <w:tcPr>
             <w:tcW w:w="1353" w:type="dxa"/>
@@ -25601,6 +25722,7 @@
     </w:p>
     <w:p>
       <w:pPr>
+        <w:keepNext/>
         <w:spacing w:before="120" w:after="60" w:line="276" w:lineRule="auto"/>
         <w:jc w:val="both"/>
       </w:pPr>
@@ -25624,7 +25746,7 @@
                     <pic:cNvPicPr/>
                   </pic:nvPicPr>
                   <pic:blipFill>
-                    <a:blip r:embed="rId12"/>
+                    <a:blip r:embed="rId13"/>
                     <a:stretch>
                       <a:fillRect/>
                     </a:stretch>
@@ -25647,8 +25769,63 @@
     </w:p>
     <w:p>
       <w:pPr>
-        <w:spacing w:line="120" w:lineRule="auto"/>
-      </w:pPr>
+        <w:pStyle w:val="Caption"/>
+        <w:jc w:val="center"/>
+        <w:rPr>
+          <w:sz w:val="20"/>
+          <w:szCs w:val="20"/>
+        </w:rPr>
+      </w:pPr>
+      <w:r>
+        <w:rPr>
+          <w:sz w:val="20"/>
+          <w:szCs w:val="20"/>
+        </w:rPr>
+        <w:t xml:space="preserve">Task 7:  </w:t>
+      </w:r>
+      <w:r>
+        <w:rPr>
+          <w:sz w:val="20"/>
+          <w:szCs w:val="20"/>
+        </w:rPr>
+        <w:fldChar w:fldCharType="begin"/>
+      </w:r>
+      <w:r>
+        <w:rPr>
+          <w:sz w:val="20"/>
+          <w:szCs w:val="20"/>
+        </w:rPr>
+        <w:instrText xml:space="preserve"> SEQ Task_7:_ \* ARABIC </w:instrText>
+      </w:r>
+      <w:r>
+        <w:rPr>
+          <w:sz w:val="20"/>
+          <w:szCs w:val="20"/>
+        </w:rPr>
+        <w:fldChar w:fldCharType="separate"/>
+      </w:r>
+      <w:r>
+        <w:rPr>
+          <w:noProof/>
+          <w:sz w:val="20"/>
+          <w:szCs w:val="20"/>
+        </w:rPr>
+        <w:t>6</w:t>
+      </w:r>
+      <w:r>
+        <w:rPr>
+          <w:sz w:val="20"/>
+          <w:szCs w:val="20"/>
+        </w:rPr>
+        <w:fldChar w:fldCharType="end"/>
+      </w:r>
+      <w:r>
+        <w:rPr>
+          <w:sz w:val="20"/>
+          <w:szCs w:val="20"/>
+        </w:rPr>
+        <w:t xml:space="preserve"> Dynamic Programming - 2nd Test Case</w:t>
+      </w:r>
     </w:p>
     <w:p>
       <w:pPr>
@@ -25656,6 +25833,7 @@
       </w:pPr>
       <w:proofErr w:type="gramStart"/>
       <w:r>
+        <w:lastRenderedPageBreak/>
         <w:t>5.6  Complexity</w:t>
       </w:r>
       <w:proofErr w:type="gramEnd"/>
@@ -25706,12 +25884,6 @@
         <w:gridCol w:w="6770"/>
       </w:tblGrid>
       <w:tr>
-        <w:tblPrEx>
-          <w:tblCellMar>
-            <w:top w:w="0" w:type="dxa"/>
-            <w:bottom w:w="0" w:type="dxa"/>
-          </w:tblCellMar>
-        </w:tblPrEx>
         <w:trPr>
           <w:tblHeader/>
         </w:trPr>
@@ -25785,12 +25957,6 @@
         </w:tc>
       </w:tr>
       <w:tr>
-        <w:tblPrEx>
-          <w:tblCellMar>
-            <w:top w:w="0" w:type="dxa"/>
-            <w:bottom w:w="0" w:type="dxa"/>
-          </w:tblCellMar>
-        </w:tblPrEx>
         <w:tc>
           <w:tcPr>
             <w:tcW w:w="2256" w:type="dxa"/>
@@ -25864,12 +26030,6 @@
         </w:tc>
       </w:tr>
       <w:tr>
-        <w:tblPrEx>
-          <w:tblCellMar>
-            <w:top w:w="0" w:type="dxa"/>
-            <w:bottom w:w="0" w:type="dxa"/>
-          </w:tblCellMar>
-        </w:tblPrEx>
         <w:tc>
           <w:tcPr>
             <w:tcW w:w="2256" w:type="dxa"/>
@@ -26059,7 +26219,6 @@
         <w:jc w:val="both"/>
       </w:pPr>
       <w:r>
-        <w:lastRenderedPageBreak/>
         <w:t>Guaranteed optimal. Feasible up to approximately n = 20 before memory becomes prohibitive.</w:t>
       </w:r>
     </w:p>
@@ -26153,12 +26312,6 @@
         <w:gridCol w:w="2166"/>
       </w:tblGrid>
       <w:tr>
-        <w:tblPrEx>
-          <w:tblCellMar>
-            <w:top w:w="0" w:type="dxa"/>
-            <w:bottom w:w="0" w:type="dxa"/>
-          </w:tblCellMar>
-        </w:tblPrEx>
         <w:trPr>
           <w:tblHeader/>
         </w:trPr>
@@ -26312,12 +26465,6 @@
         </w:tc>
       </w:tr>
       <w:tr>
-        <w:tblPrEx>
-          <w:tblCellMar>
-            <w:top w:w="0" w:type="dxa"/>
-            <w:bottom w:w="0" w:type="dxa"/>
-          </w:tblCellMar>
-        </w:tblPrEx>
         <w:tc>
           <w:tcPr>
             <w:tcW w:w="2527" w:type="dxa"/>
@@ -26471,12 +26618,6 @@
         </w:tc>
       </w:tr>
       <w:tr>
-        <w:tblPrEx>
-          <w:tblCellMar>
-            <w:top w:w="0" w:type="dxa"/>
-            <w:bottom w:w="0" w:type="dxa"/>
-          </w:tblCellMar>
-        </w:tblPrEx>
         <w:tc>
           <w:tcPr>
             <w:tcW w:w="2527" w:type="dxa"/>
@@ -26603,12 +26744,6 @@
         </w:tc>
       </w:tr>
       <w:tr>
-        <w:tblPrEx>
-          <w:tblCellMar>
-            <w:top w:w="0" w:type="dxa"/>
-            <w:bottom w:w="0" w:type="dxa"/>
-          </w:tblCellMar>
-        </w:tblPrEx>
         <w:tc>
           <w:tcPr>
             <w:tcW w:w="2527" w:type="dxa"/>
@@ -26735,12 +26870,6 @@
         </w:tc>
       </w:tr>
       <w:tr>
-        <w:tblPrEx>
-          <w:tblCellMar>
-            <w:top w:w="0" w:type="dxa"/>
-            <w:bottom w:w="0" w:type="dxa"/>
-          </w:tblCellMar>
-        </w:tblPrEx>
         <w:tc>
           <w:tcPr>
             <w:tcW w:w="2527" w:type="dxa"/>
@@ -26867,12 +26996,6 @@
         </w:tc>
       </w:tr>
       <w:tr>
-        <w:tblPrEx>
-          <w:tblCellMar>
-            <w:top w:w="0" w:type="dxa"/>
-            <w:bottom w:w="0" w:type="dxa"/>
-          </w:tblCellMar>
-        </w:tblPrEx>
         <w:tc>
           <w:tcPr>
             <w:tcW w:w="2527" w:type="dxa"/>
@@ -26999,12 +27122,6 @@
         </w:tc>
       </w:tr>
       <w:tr>
-        <w:tblPrEx>
-          <w:tblCellMar>
-            <w:top w:w="0" w:type="dxa"/>
-            <w:bottom w:w="0" w:type="dxa"/>
-          </w:tblCellMar>
-        </w:tblPrEx>
         <w:tc>
           <w:tcPr>
             <w:tcW w:w="2527" w:type="dxa"/>
@@ -27268,7 +27385,11 @@
         <w:jc w:val="both"/>
       </w:pPr>
       <w:r>
-        <w:t>For very large n (e.g., n &gt; 20), exact algorithms are impractical. Approximation schemes such as PTAS (Polynomial-Time Approximation Schemes) can produce solutions within a guaranteed factor of the optimum in polynomial time, making them suitable for industrial-scale instances.</w:t>
+        <w:t xml:space="preserve">For very large n (e.g., n &gt; 20), exact algorithms are impractical. Approximation schemes such as PTAS (Polynomial-Time Approximation Schemes) can produce solutions within a </w:t>
+      </w:r>
+      <w:r>
+        <w:lastRenderedPageBreak/>
+        <w:t>guaranteed factor of the optimum in polynomial time, making them suitable for industrial-scale instances.</w:t>
       </w:r>
     </w:p>
     <w:p>
@@ -27326,7 +27447,6 @@
         <w:jc w:val="both"/>
       </w:pPr>
       <w:r>
-        <w:lastRenderedPageBreak/>
         <w:t>Three approaches were implemented: Brute Force, Divide and Conquer (Merge Sort), and Dynamic Programming (bitmask DP).</w:t>
       </w:r>
     </w:p>
@@ -27521,7 +27641,7 @@
       <w:r>
         <w:t xml:space="preserve">. (2024). Job Sequencing Problem. </w:t>
       </w:r>
-      <w:hyperlink r:id="rId13" w:history="1">
+      <w:hyperlink r:id="rId14" w:history="1">
         <w:r>
           <w:rPr>
             <w:rStyle w:val="Hyperlink"/>
@@ -27531,8 +27651,8 @@
       </w:hyperlink>
     </w:p>
     <w:sectPr>
-      <w:headerReference w:type="default" r:id="rId14"/>
-      <w:footerReference w:type="default" r:id="rId15"/>
+      <w:headerReference w:type="default" r:id="rId15"/>
+      <w:footerReference w:type="default" r:id="rId16"/>
       <w:pgSz w:w="11906" w:h="16838"/>
       <w:pgMar w:top="1440" w:right="1440" w:bottom="1440" w:left="1440" w:header="708" w:footer="708" w:gutter="0"/>
       <w:cols w:space="720"/>
@@ -27568,25 +27688,11 @@
       <w:pBdr>
         <w:top w:val="single" w:sz="6" w:space="4" w:color="2E74B5"/>
       </w:pBdr>
+      <w:tabs>
+        <w:tab w:val="left" w:pos="444"/>
+      </w:tabs>
       <w:spacing w:before="80"/>
-      <w:jc w:val="center"/>
     </w:pPr>
-    <w:r>
-      <w:rPr>
-        <w:color w:val="777777"/>
-        <w:sz w:val="18"/>
-        <w:szCs w:val="18"/>
-      </w:rPr>
-      <w:t xml:space="preserve">Page </w:t>
-    </w:r>
-    <w:r>
-      <w:rPr>
-        <w:color w:val="777777"/>
-        <w:sz w:val="18"/>
-        <w:szCs w:val="18"/>
-      </w:rPr>
-      <w:pgNum/>
-    </w:r>
   </w:p>
 </w:ftr>
 </file>
@@ -28403,6 +28509,7 @@
   <w:style w:type="character" w:default="1" w:styleId="DefaultParagraphFont">
     <w:name w:val="Default Paragraph Font"/>
     <w:uiPriority w:val="1"/>
+    <w:semiHidden/>
     <w:unhideWhenUsed/>
   </w:style>
   <w:style w:type="table" w:default="1" w:styleId="TableNormal">
@@ -28528,6 +28635,67 @@
     <w:rPr>
       <w:color w:val="605E5C"/>
       <w:shd w:val="clear" w:color="auto" w:fill="E1DFDD"/>
+    </w:rPr>
+  </w:style>
+  <w:style w:type="paragraph" w:styleId="Header">
+    <w:name w:val="header"/>
+    <w:basedOn w:val="Normal"/>
+    <w:link w:val="HeaderChar"/>
+    <w:uiPriority w:val="99"/>
+    <w:unhideWhenUsed/>
+    <w:rsid w:val="0008518C"/>
+    <w:pPr>
+      <w:tabs>
+        <w:tab w:val="center" w:pos="4680"/>
+        <w:tab w:val="right" w:pos="9360"/>
+      </w:tabs>
+    </w:pPr>
+  </w:style>
+  <w:style w:type="character" w:customStyle="1" w:styleId="HeaderChar">
+    <w:name w:val="Header Char"/>
+    <w:basedOn w:val="DefaultParagraphFont"/>
+    <w:link w:val="Header"/>
+    <w:uiPriority w:val="99"/>
+    <w:rsid w:val="0008518C"/>
+  </w:style>
+  <w:style w:type="paragraph" w:styleId="Footer">
+    <w:name w:val="footer"/>
+    <w:basedOn w:val="Normal"/>
+    <w:link w:val="FooterChar"/>
+    <w:uiPriority w:val="99"/>
+    <w:unhideWhenUsed/>
+    <w:rsid w:val="0008518C"/>
+    <w:pPr>
+      <w:tabs>
+        <w:tab w:val="center" w:pos="4680"/>
+        <w:tab w:val="right" w:pos="9360"/>
+      </w:tabs>
+    </w:pPr>
+  </w:style>
+  <w:style w:type="character" w:customStyle="1" w:styleId="FooterChar">
+    <w:name w:val="Footer Char"/>
+    <w:basedOn w:val="DefaultParagraphFont"/>
+    <w:link w:val="Footer"/>
+    <w:uiPriority w:val="99"/>
+    <w:rsid w:val="0008518C"/>
+  </w:style>
+  <w:style w:type="paragraph" w:styleId="Caption">
+    <w:name w:val="caption"/>
+    <w:basedOn w:val="Normal"/>
+    <w:next w:val="Normal"/>
+    <w:uiPriority w:val="35"/>
+    <w:unhideWhenUsed/>
+    <w:qFormat/>
+    <w:rsid w:val="0008518C"/>
+    <w:pPr>
+      <w:spacing w:after="200"/>
+    </w:pPr>
+    <w:rPr>
+      <w:i/>
+      <w:iCs/>
+      <w:color w:val="0E2841" w:themeColor="text2"/>
+      <w:sz w:val="18"/>
+      <w:szCs w:val="18"/>
     </w:rPr>
   </w:style>
 </w:styles>
@@ -28846,4 +29014,16 @@
     </a:ext>
   </a:extLst>
 </a:theme>
+</file>
+
+<file path=customXml/item1.xml><?xml version="1.0" encoding="utf-8"?>
+<b:Sources xmlns:b="http://schemas.openxmlformats.org/officeDocument/2006/bibliography" xmlns="http://schemas.openxmlformats.org/officeDocument/2006/bibliography" SelectedStyle="\APASixthEditionOfficeOnline.xsl" StyleName="APA" Version="6"/>
+</file>
+
+<file path=customXml/itemProps1.xml><?xml version="1.0" encoding="utf-8"?>
+<ds:datastoreItem xmlns:ds="http://schemas.openxmlformats.org/officeDocument/2006/customXml" ds:itemID="{CD5D06FC-1DE9-41A3-9B5F-AA23E9C20BDC}">
+  <ds:schemaRefs>
+    <ds:schemaRef ds:uri="http://schemas.openxmlformats.org/officeDocument/2006/bibliography"/>
+  </ds:schemaRefs>
+</ds:datastoreItem>
 </file>
</xml_diff>

<commit_message>
Report: Split references into a single document
</commit_message>
<xml_diff>
--- a/Report/Task7_JobScheduling_Report.docx
+++ b/Report/Task7_JobScheduling_Report.docx
@@ -212,11 +212,9 @@
       <w:pPr>
         <w:pStyle w:val="Heading2"/>
       </w:pPr>
-      <w:proofErr w:type="gramStart"/>
       <w:r>
         <w:t>3.1  Methodology</w:t>
       </w:r>
-      <w:proofErr w:type="gramEnd"/>
     </w:p>
     <w:p>
       <w:pPr>
@@ -231,13 +229,8 @@
       <w:pPr>
         <w:pStyle w:val="Heading2"/>
       </w:pPr>
-      <w:proofErr w:type="gramStart"/>
-      <w:r>
-        <w:t>3.2  Step</w:t>
-      </w:r>
-      <w:proofErr w:type="gramEnd"/>
-      <w:r>
-        <w:t>-by-Step Description</w:t>
+      <w:r>
+        <w:t>3.2  Step-by-Step Description</w:t>
       </w:r>
     </w:p>
     <w:p>
@@ -251,15 +244,7 @@
         <w:jc w:val="both"/>
       </w:pPr>
       <w:r>
-        <w:t xml:space="preserve">Read n, and the arrays </w:t>
-      </w:r>
-      <w:proofErr w:type="gramStart"/>
-      <w:r>
-        <w:t>t[</w:t>
-      </w:r>
-      <w:proofErr w:type="gramEnd"/>
-      <w:r>
-        <w:t>], p[], d[].</w:t>
+        <w:t>Read n, and the arrays t[], p[], d[].</w:t>
       </w:r>
     </w:p>
     <w:p>
@@ -273,15 +258,7 @@
         <w:jc w:val="both"/>
       </w:pPr>
       <w:r>
-        <w:t xml:space="preserve">Initialize a job index array </w:t>
-      </w:r>
-      <w:proofErr w:type="gramStart"/>
-      <w:r>
-        <w:t>job[</w:t>
-      </w:r>
-      <w:proofErr w:type="gramEnd"/>
-      <w:r>
-        <w:t>] = [0, 1, 2, …, n−1].</w:t>
+        <w:t>Initialize a job index array job[] = [0, 1, 2, …, n−1].</w:t>
       </w:r>
     </w:p>
     <w:p>
@@ -360,11 +337,9 @@
       <w:pPr>
         <w:pStyle w:val="Heading2"/>
       </w:pPr>
-      <w:proofErr w:type="gramStart"/>
       <w:r>
         <w:t>3.3  Pseudocode</w:t>
       </w:r>
-      <w:proofErr w:type="gramEnd"/>
     </w:p>
     <w:p>
       <w:pPr>
@@ -380,7 +355,6 @@
         <w:ind w:left="360"/>
       </w:pPr>
       <w:proofErr w:type="spellStart"/>
-      <w:proofErr w:type="gramStart"/>
       <w:r>
         <w:rPr>
           <w:rFonts w:ascii="Courier New" w:eastAsia="Courier New" w:hAnsi="Courier New" w:cs="Courier New"/>
@@ -398,17 +372,7 @@
           <w:sz w:val="18"/>
           <w:szCs w:val="18"/>
         </w:rPr>
-        <w:t>(</w:t>
-      </w:r>
-      <w:proofErr w:type="gramEnd"/>
-      <w:r>
-        <w:rPr>
-          <w:rFonts w:ascii="Courier New" w:eastAsia="Courier New" w:hAnsi="Courier New" w:cs="Courier New"/>
-          <w:color w:val="1A1A1A"/>
-          <w:sz w:val="18"/>
-          <w:szCs w:val="18"/>
-        </w:rPr>
-        <w:t>n, t[], p[], d[]):</w:t>
+        <w:t>(n, t[], p[], d[]):</w:t>
       </w:r>
     </w:p>
     <w:p>
@@ -427,27 +391,7 @@
           <w:szCs w:val="18"/>
         </w:rPr>
         <w:lastRenderedPageBreak/>
-        <w:t xml:space="preserve">    </w:t>
-      </w:r>
-      <w:proofErr w:type="gramStart"/>
-      <w:r>
-        <w:rPr>
-          <w:rFonts w:ascii="Courier New" w:eastAsia="Courier New" w:hAnsi="Courier New" w:cs="Courier New"/>
-          <w:color w:val="1A1A1A"/>
-          <w:sz w:val="18"/>
-          <w:szCs w:val="18"/>
-        </w:rPr>
-        <w:t>job[</w:t>
-      </w:r>
-      <w:proofErr w:type="gramEnd"/>
-      <w:r>
-        <w:rPr>
-          <w:rFonts w:ascii="Courier New" w:eastAsia="Courier New" w:hAnsi="Courier New" w:cs="Courier New"/>
-          <w:color w:val="1A1A1A"/>
-          <w:sz w:val="18"/>
-          <w:szCs w:val="18"/>
-        </w:rPr>
-        <w:t>]         ← [0, 1, 2, …, n-1]</w:t>
+        <w:t xml:space="preserve">    job[]         ← [0, 1, 2, …, n-1]</w:t>
       </w:r>
     </w:p>
     <w:p>
@@ -465,27 +409,7 @@
           <w:sz w:val="18"/>
           <w:szCs w:val="18"/>
         </w:rPr>
-        <w:t xml:space="preserve">    </w:t>
-      </w:r>
-      <w:proofErr w:type="gramStart"/>
-      <w:r>
-        <w:rPr>
-          <w:rFonts w:ascii="Courier New" w:eastAsia="Courier New" w:hAnsi="Courier New" w:cs="Courier New"/>
-          <w:color w:val="1A1A1A"/>
-          <w:sz w:val="18"/>
-          <w:szCs w:val="18"/>
-        </w:rPr>
-        <w:t>result[</w:t>
-      </w:r>
-      <w:proofErr w:type="gramEnd"/>
-      <w:r>
-        <w:rPr>
-          <w:rFonts w:ascii="Courier New" w:eastAsia="Courier New" w:hAnsi="Courier New" w:cs="Courier New"/>
-          <w:color w:val="1A1A1A"/>
-          <w:sz w:val="18"/>
-          <w:szCs w:val="18"/>
-        </w:rPr>
-        <w:t>]      ← []</w:t>
+        <w:t xml:space="preserve">    result[]      ← []</w:t>
       </w:r>
     </w:p>
     <w:p>
@@ -941,27 +865,7 @@
           <w:sz w:val="18"/>
           <w:szCs w:val="18"/>
         </w:rPr>
-        <w:t xml:space="preserve">            </w:t>
-      </w:r>
-      <w:proofErr w:type="gramStart"/>
-      <w:r>
-        <w:rPr>
-          <w:rFonts w:ascii="Courier New" w:eastAsia="Courier New" w:hAnsi="Courier New" w:cs="Courier New"/>
-          <w:color w:val="1A1A1A"/>
-          <w:sz w:val="18"/>
-          <w:szCs w:val="18"/>
-        </w:rPr>
-        <w:t>result[</w:t>
-      </w:r>
-      <w:proofErr w:type="gramEnd"/>
-      <w:r>
-        <w:rPr>
-          <w:rFonts w:ascii="Courier New" w:eastAsia="Courier New" w:hAnsi="Courier New" w:cs="Courier New"/>
-          <w:color w:val="1A1A1A"/>
-          <w:sz w:val="18"/>
-          <w:szCs w:val="18"/>
-        </w:rPr>
-        <w:t>] ← copy of job[]</w:t>
+        <w:t xml:space="preserve">            result[] ← copy of job[]</w:t>
       </w:r>
     </w:p>
     <w:p>
@@ -1008,27 +912,7 @@
           <w:sz w:val="18"/>
           <w:szCs w:val="18"/>
         </w:rPr>
-        <w:t>(</w:t>
-      </w:r>
-      <w:proofErr w:type="gramStart"/>
-      <w:r>
-        <w:rPr>
-          <w:rFonts w:ascii="Courier New" w:eastAsia="Courier New" w:hAnsi="Courier New" w:cs="Courier New"/>
-          <w:color w:val="1A1A1A"/>
-          <w:sz w:val="18"/>
-          <w:szCs w:val="18"/>
-        </w:rPr>
-        <w:t>job[</w:t>
-      </w:r>
-      <w:proofErr w:type="gramEnd"/>
-      <w:r>
-        <w:rPr>
-          <w:rFonts w:ascii="Courier New" w:eastAsia="Courier New" w:hAnsi="Courier New" w:cs="Courier New"/>
-          <w:color w:val="1A1A1A"/>
-          <w:sz w:val="18"/>
-          <w:szCs w:val="18"/>
-        </w:rPr>
-        <w:t>]) exists</w:t>
+        <w:t>(job[]) exists</w:t>
       </w:r>
     </w:p>
     <w:p>
@@ -1055,9 +939,9 @@
           <w:sz w:val="18"/>
           <w:szCs w:val="18"/>
         </w:rPr>
-        <w:t xml:space="preserve">    PRINT </w:t>
-      </w:r>
-      <w:proofErr w:type="gramStart"/>
+        <w:t xml:space="preserve">    PRINT result[], </w:t>
+      </w:r>
+      <w:proofErr w:type="spellStart"/>
       <w:r>
         <w:rPr>
           <w:rFonts w:ascii="Courier New" w:eastAsia="Courier New" w:hAnsi="Courier New" w:cs="Courier New"/>
@@ -1065,26 +949,6 @@
           <w:sz w:val="18"/>
           <w:szCs w:val="18"/>
         </w:rPr>
-        <w:t>result[</w:t>
-      </w:r>
-      <w:proofErr w:type="gramEnd"/>
-      <w:r>
-        <w:rPr>
-          <w:rFonts w:ascii="Courier New" w:eastAsia="Courier New" w:hAnsi="Courier New" w:cs="Courier New"/>
-          <w:color w:val="1A1A1A"/>
-          <w:sz w:val="18"/>
-          <w:szCs w:val="18"/>
-        </w:rPr>
-        <w:t xml:space="preserve">], </w:t>
-      </w:r>
-      <w:proofErr w:type="spellStart"/>
-      <w:r>
-        <w:rPr>
-          <w:rFonts w:ascii="Courier New" w:eastAsia="Courier New" w:hAnsi="Courier New" w:cs="Courier New"/>
-          <w:color w:val="1A1A1A"/>
-          <w:sz w:val="18"/>
-          <w:szCs w:val="18"/>
-        </w:rPr>
         <w:t>min_penalties</w:t>
       </w:r>
       <w:proofErr w:type="spellEnd"/>
@@ -1098,13 +962,8 @@
       <w:pPr>
         <w:pStyle w:val="Heading2"/>
       </w:pPr>
-      <w:proofErr w:type="gramStart"/>
-      <w:r>
-        <w:t>3.4  Implementation</w:t>
-      </w:r>
-      <w:proofErr w:type="gramEnd"/>
-      <w:r>
-        <w:t xml:space="preserve"> Code (C++)</w:t>
+      <w:r>
+        <w:t>3.4  Implementation Code (C++)</w:t>
       </w:r>
     </w:p>
     <w:p>
@@ -1390,7 +1249,6 @@
         </w:rPr>
         <w:t xml:space="preserve"> </w:t>
       </w:r>
-      <w:proofErr w:type="gramStart"/>
       <w:r>
         <w:rPr>
           <w:rFonts w:eastAsia="Times New Roman"/>
@@ -1407,17 +1265,7 @@
           <w:sz w:val="20"/>
           <w:szCs w:val="20"/>
         </w:rPr>
-        <w:t>(</w:t>
-      </w:r>
-      <w:proofErr w:type="gramEnd"/>
-      <w:r>
-        <w:rPr>
-          <w:rFonts w:eastAsia="Times New Roman"/>
-          <w:color w:val="D4D4D4"/>
-          <w:sz w:val="20"/>
-          <w:szCs w:val="20"/>
-        </w:rPr>
-        <w:t>)</w:t>
+        <w:t>()</w:t>
       </w:r>
     </w:p>
     <w:p>
@@ -4115,7 +3963,6 @@
         <w:t>(</w:t>
       </w:r>
       <w:proofErr w:type="spellStart"/>
-      <w:proofErr w:type="gramStart"/>
       <w:r>
         <w:rPr>
           <w:rFonts w:eastAsia="Times New Roman"/>
@@ -4144,7 +3991,6 @@
         <w:t>begin</w:t>
       </w:r>
       <w:proofErr w:type="spellEnd"/>
-      <w:proofErr w:type="gramEnd"/>
       <w:r>
         <w:rPr>
           <w:rFonts w:eastAsia="Times New Roman"/>
@@ -4865,7 +4711,6 @@
         </w:rPr>
         <w:t xml:space="preserve"> </w:t>
       </w:r>
-      <w:proofErr w:type="gramStart"/>
       <w:r>
         <w:rPr>
           <w:rFonts w:eastAsia="Times New Roman"/>
@@ -4873,17 +4718,7 @@
           <w:sz w:val="20"/>
           <w:szCs w:val="20"/>
         </w:rPr>
-        <w:t>"  deadline</w:t>
-      </w:r>
-      <w:proofErr w:type="gramEnd"/>
-      <w:r>
-        <w:rPr>
-          <w:rFonts w:eastAsia="Times New Roman"/>
-          <w:color w:val="CE9178"/>
-          <w:sz w:val="20"/>
-          <w:szCs w:val="20"/>
-        </w:rPr>
-        <w:t>: "</w:t>
+        <w:t>"  deadline: "</w:t>
       </w:r>
       <w:r>
         <w:rPr>
@@ -5269,14 +5104,9 @@
       <w:pPr>
         <w:pStyle w:val="Heading2"/>
       </w:pPr>
-      <w:proofErr w:type="gramStart"/>
       <w:r>
         <w:lastRenderedPageBreak/>
-        <w:t>3.5  Test</w:t>
-      </w:r>
-      <w:proofErr w:type="gramEnd"/>
-      <w:r>
-        <w:t xml:space="preserve"> Cases</w:t>
+        <w:t>3.5  Test Cases</w:t>
       </w:r>
     </w:p>
     <w:p>
@@ -6022,15 +5852,7 @@
         <w:jc w:val="both"/>
       </w:pPr>
       <w:r>
-        <w:t xml:space="preserve">Job 3: cumulative time = 1 ≤ </w:t>
-      </w:r>
-      <w:proofErr w:type="gramStart"/>
-      <w:r>
-        <w:t>2  →</w:t>
-      </w:r>
-      <w:proofErr w:type="gramEnd"/>
-      <w:r>
-        <w:t xml:space="preserve"> no penalty</w:t>
+        <w:t>Job 3: cumulative time = 1 ≤ 2  → no penalty</w:t>
       </w:r>
     </w:p>
     <w:p>
@@ -6044,15 +5866,7 @@
         <w:jc w:val="both"/>
       </w:pPr>
       <w:r>
-        <w:t xml:space="preserve">Job 1: cumulative time = 4 ≤ </w:t>
-      </w:r>
-      <w:proofErr w:type="gramStart"/>
-      <w:r>
-        <w:t>4  →</w:t>
-      </w:r>
-      <w:proofErr w:type="gramEnd"/>
-      <w:r>
-        <w:t xml:space="preserve"> no penalty</w:t>
+        <w:t>Job 1: cumulative time = 4 ≤ 4  → no penalty</w:t>
       </w:r>
     </w:p>
     <w:p>
@@ -6066,15 +5880,7 @@
         <w:jc w:val="both"/>
       </w:pPr>
       <w:r>
-        <w:t xml:space="preserve">Job 2: cumulative time = 6 &gt; </w:t>
-      </w:r>
-      <w:proofErr w:type="gramStart"/>
-      <w:r>
-        <w:t>5  →</w:t>
-      </w:r>
-      <w:proofErr w:type="gramEnd"/>
-      <w:r>
-        <w:t xml:space="preserve"> penalty = 3</w:t>
+        <w:t>Job 2: cumulative time = 6 &gt; 5  → penalty = 3</w:t>
       </w:r>
     </w:p>
     <w:p>
@@ -6083,15 +5889,7 @@
         <w:jc w:val="both"/>
       </w:pPr>
       <w:r>
-        <w:t xml:space="preserve">Total Penalty = </w:t>
-      </w:r>
-      <w:proofErr w:type="gramStart"/>
-      <w:r>
-        <w:t>3  (</w:t>
-      </w:r>
-      <w:proofErr w:type="gramEnd"/>
-      <w:r>
-        <w:t>optimal)</w:t>
+        <w:t>Total Penalty = 3  (optimal)</w:t>
       </w:r>
     </w:p>
     <w:p>
@@ -7076,13 +6874,8 @@
       <w:pPr>
         <w:pStyle w:val="Heading2"/>
       </w:pPr>
-      <w:proofErr w:type="gramStart"/>
-      <w:r>
-        <w:t>3.6  Complexity</w:t>
-      </w:r>
-      <w:proofErr w:type="gramEnd"/>
-      <w:r>
-        <w:t xml:space="preserve"> Analysis</w:t>
+      <w:r>
+        <w:t>3.6  Complexity Analysis</w:t>
       </w:r>
     </w:p>
     <w:p>
@@ -7254,21 +7047,12 @@
             <w:pPr>
               <w:jc w:val="center"/>
             </w:pPr>
-            <w:proofErr w:type="gramStart"/>
             <w:r>
               <w:rPr>
                 <w:sz w:val="22"/>
                 <w:szCs w:val="22"/>
               </w:rPr>
-              <w:t>O(</w:t>
-            </w:r>
-            <w:proofErr w:type="gramEnd"/>
-            <w:r>
-              <w:rPr>
-                <w:sz w:val="22"/>
-                <w:szCs w:val="22"/>
-              </w:rPr>
-              <w:t>n! × n) — Generates all n! permutations; each evaluation takes O(n)</w:t>
+              <w:t>O(n! × n) — Generates all n! permutations; each evaluation takes O(n)</w:t>
             </w:r>
           </w:p>
         </w:tc>
@@ -7379,11 +7163,9 @@
       <w:pPr>
         <w:pStyle w:val="Heading2"/>
       </w:pPr>
-      <w:proofErr w:type="gramStart"/>
       <w:r>
         <w:t>4.1  Methodology</w:t>
       </w:r>
-      <w:proofErr w:type="gramEnd"/>
     </w:p>
     <w:p>
       <w:pPr>
@@ -7391,15 +7173,7 @@
         <w:jc w:val="both"/>
       </w:pPr>
       <w:r>
-        <w:t xml:space="preserve">The Divide and Conquer approach </w:t>
-      </w:r>
-      <w:proofErr w:type="gramStart"/>
-      <w:r>
-        <w:t>applies</w:t>
-      </w:r>
-      <w:proofErr w:type="gramEnd"/>
-      <w:r>
-        <w:t xml:space="preserve"> a modified Merge Sort to order jobs according to a pairwise penalty comparison. For any two jobs, the comparator </w:t>
+        <w:t xml:space="preserve">The Divide and Conquer approach applies a modified Merge Sort to order jobs according to a pairwise penalty comparison. For any two jobs, the comparator </w:t>
       </w:r>
       <w:proofErr w:type="spellStart"/>
       <w:r>
@@ -7407,28 +7181,15 @@
       </w:r>
       <w:proofErr w:type="spellEnd"/>
       <w:r>
-        <w:t xml:space="preserve"> determines which job should be scheduled first by computing the total penalty under each of the two possible orderings and placing the lower-penalty option first. This transforms the scheduling problem into a sort, running in </w:t>
-      </w:r>
-      <w:proofErr w:type="gramStart"/>
-      <w:r>
-        <w:t>O(</w:t>
-      </w:r>
-      <w:proofErr w:type="gramEnd"/>
-      <w:r>
-        <w:t>n log n).</w:t>
+        <w:t xml:space="preserve"> determines which job should be scheduled first by computing the total penalty under each of the two possible orderings and placing the lower-penalty option first. This transforms the scheduling problem into a sort, running in O(n log n).</w:t>
       </w:r>
     </w:p>
     <w:p>
       <w:pPr>
         <w:pStyle w:val="Heading2"/>
       </w:pPr>
-      <w:proofErr w:type="gramStart"/>
-      <w:r>
-        <w:t>4.2  Step</w:t>
-      </w:r>
-      <w:proofErr w:type="gramEnd"/>
-      <w:r>
-        <w:t>-by-Step Description</w:t>
+      <w:r>
+        <w:t>4.2  Step-by-Step Description</w:t>
       </w:r>
     </w:p>
     <w:p>
@@ -7442,15 +7203,7 @@
         <w:jc w:val="both"/>
       </w:pPr>
       <w:r>
-        <w:t xml:space="preserve">Read n, and the arrays </w:t>
-      </w:r>
-      <w:proofErr w:type="gramStart"/>
-      <w:r>
-        <w:t>t[</w:t>
-      </w:r>
-      <w:proofErr w:type="gramEnd"/>
-      <w:r>
-        <w:t>], p[], d[].</w:t>
+        <w:t>Read n, and the arrays t[], p[], d[].</w:t>
       </w:r>
     </w:p>
     <w:p>
@@ -7464,15 +7217,7 @@
         <w:jc w:val="both"/>
       </w:pPr>
       <w:r>
-        <w:t xml:space="preserve">Initialize a job index array </w:t>
-      </w:r>
-      <w:proofErr w:type="gramStart"/>
-      <w:r>
-        <w:t>result[</w:t>
-      </w:r>
-      <w:proofErr w:type="gramEnd"/>
-      <w:r>
-        <w:t>] = [0, 1, …, n−1].</w:t>
+        <w:t>Initialize a job index array result[] = [0, 1, …, n−1].</w:t>
       </w:r>
     </w:p>
     <w:p>
@@ -7486,15 +7231,7 @@
         <w:jc w:val="both"/>
       </w:pPr>
       <w:r>
-        <w:t xml:space="preserve">Apply Merge Sort on </w:t>
-      </w:r>
-      <w:proofErr w:type="gramStart"/>
-      <w:r>
-        <w:t>result[</w:t>
-      </w:r>
-      <w:proofErr w:type="gramEnd"/>
-      <w:r>
-        <w:t xml:space="preserve">] using a custom comparator </w:t>
+        <w:t xml:space="preserve">Apply Merge Sort on result[] using a custom comparator </w:t>
       </w:r>
       <w:proofErr w:type="spellStart"/>
       <w:r>
@@ -7546,11 +7283,9 @@
       <w:pPr>
         <w:pStyle w:val="Heading2"/>
       </w:pPr>
-      <w:proofErr w:type="gramStart"/>
       <w:r>
         <w:t>4.3  Pseudocode</w:t>
       </w:r>
-      <w:proofErr w:type="gramEnd"/>
     </w:p>
     <w:p>
       <w:pPr>
@@ -7566,7 +7301,6 @@
         <w:ind w:left="360"/>
       </w:pPr>
       <w:proofErr w:type="spellStart"/>
-      <w:proofErr w:type="gramStart"/>
       <w:r>
         <w:rPr>
           <w:rFonts w:ascii="Courier New" w:eastAsia="Courier New" w:hAnsi="Courier New" w:cs="Courier New"/>
@@ -7584,17 +7318,7 @@
           <w:sz w:val="18"/>
           <w:szCs w:val="18"/>
         </w:rPr>
-        <w:t>(</w:t>
-      </w:r>
-      <w:proofErr w:type="gramEnd"/>
-      <w:r>
-        <w:rPr>
-          <w:rFonts w:ascii="Courier New" w:eastAsia="Courier New" w:hAnsi="Courier New" w:cs="Courier New"/>
-          <w:color w:val="1A1A1A"/>
-          <w:sz w:val="18"/>
-          <w:szCs w:val="18"/>
-        </w:rPr>
-        <w:t>job1, job2):</w:t>
+        <w:t>(job1, job2):</w:t>
       </w:r>
     </w:p>
     <w:p>
@@ -7612,27 +7336,7 @@
           <w:sz w:val="18"/>
           <w:szCs w:val="18"/>
         </w:rPr>
-        <w:t xml:space="preserve">    penalty_if_1_first ← (t[job1] &gt; d[job1</w:t>
-      </w:r>
-      <w:proofErr w:type="gramStart"/>
-      <w:r>
-        <w:rPr>
-          <w:rFonts w:ascii="Courier New" w:eastAsia="Courier New" w:hAnsi="Courier New" w:cs="Courier New"/>
-          <w:color w:val="1A1A1A"/>
-          <w:sz w:val="18"/>
-          <w:szCs w:val="18"/>
-        </w:rPr>
-        <w:t>] ?</w:t>
-      </w:r>
-      <w:proofErr w:type="gramEnd"/>
-      <w:r>
-        <w:rPr>
-          <w:rFonts w:ascii="Courier New" w:eastAsia="Courier New" w:hAnsi="Courier New" w:cs="Courier New"/>
-          <w:color w:val="1A1A1A"/>
-          <w:sz w:val="18"/>
-          <w:szCs w:val="18"/>
-        </w:rPr>
-        <w:t xml:space="preserve"> p[job1] : 0)</w:t>
+        <w:t xml:space="preserve">    penalty_if_1_first ← (t[job1] &gt; d[job1] ? p[job1] : 0)</w:t>
       </w:r>
     </w:p>
     <w:p>
@@ -7650,27 +7354,7 @@
           <w:sz w:val="18"/>
           <w:szCs w:val="18"/>
         </w:rPr>
-        <w:t xml:space="preserve">                       + (t[job1] + t[job2] &gt; d[job2</w:t>
-      </w:r>
-      <w:proofErr w:type="gramStart"/>
-      <w:r>
-        <w:rPr>
-          <w:rFonts w:ascii="Courier New" w:eastAsia="Courier New" w:hAnsi="Courier New" w:cs="Courier New"/>
-          <w:color w:val="1A1A1A"/>
-          <w:sz w:val="18"/>
-          <w:szCs w:val="18"/>
-        </w:rPr>
-        <w:t>] ?</w:t>
-      </w:r>
-      <w:proofErr w:type="gramEnd"/>
-      <w:r>
-        <w:rPr>
-          <w:rFonts w:ascii="Courier New" w:eastAsia="Courier New" w:hAnsi="Courier New" w:cs="Courier New"/>
-          <w:color w:val="1A1A1A"/>
-          <w:sz w:val="18"/>
-          <w:szCs w:val="18"/>
-        </w:rPr>
-        <w:t xml:space="preserve"> p[job2] : 0)</w:t>
+        <w:t xml:space="preserve">                       + (t[job1] + t[job2] &gt; d[job2] ? p[job2] : 0)</w:t>
       </w:r>
     </w:p>
     <w:p>
@@ -7697,27 +7381,7 @@
           <w:sz w:val="18"/>
           <w:szCs w:val="18"/>
         </w:rPr>
-        <w:t xml:space="preserve">    penalty_if_2_first ← (t[job2] &gt; d[job2</w:t>
-      </w:r>
-      <w:proofErr w:type="gramStart"/>
-      <w:r>
-        <w:rPr>
-          <w:rFonts w:ascii="Courier New" w:eastAsia="Courier New" w:hAnsi="Courier New" w:cs="Courier New"/>
-          <w:color w:val="1A1A1A"/>
-          <w:sz w:val="18"/>
-          <w:szCs w:val="18"/>
-        </w:rPr>
-        <w:t>] ?</w:t>
-      </w:r>
-      <w:proofErr w:type="gramEnd"/>
-      <w:r>
-        <w:rPr>
-          <w:rFonts w:ascii="Courier New" w:eastAsia="Courier New" w:hAnsi="Courier New" w:cs="Courier New"/>
-          <w:color w:val="1A1A1A"/>
-          <w:sz w:val="18"/>
-          <w:szCs w:val="18"/>
-        </w:rPr>
-        <w:t xml:space="preserve"> p[job2] : 0)</w:t>
+        <w:t xml:space="preserve">    penalty_if_2_first ← (t[job2] &gt; d[job2] ? p[job2] : 0)</w:t>
       </w:r>
     </w:p>
     <w:p>
@@ -7735,27 +7399,7 @@
           <w:sz w:val="18"/>
           <w:szCs w:val="18"/>
         </w:rPr>
-        <w:t xml:space="preserve">                       + (t[job1] + t[job2] &gt; d[job1</w:t>
-      </w:r>
-      <w:proofErr w:type="gramStart"/>
-      <w:r>
-        <w:rPr>
-          <w:rFonts w:ascii="Courier New" w:eastAsia="Courier New" w:hAnsi="Courier New" w:cs="Courier New"/>
-          <w:color w:val="1A1A1A"/>
-          <w:sz w:val="18"/>
-          <w:szCs w:val="18"/>
-        </w:rPr>
-        <w:t>] ?</w:t>
-      </w:r>
-      <w:proofErr w:type="gramEnd"/>
-      <w:r>
-        <w:rPr>
-          <w:rFonts w:ascii="Courier New" w:eastAsia="Courier New" w:hAnsi="Courier New" w:cs="Courier New"/>
-          <w:color w:val="1A1A1A"/>
-          <w:sz w:val="18"/>
-          <w:szCs w:val="18"/>
-        </w:rPr>
-        <w:t xml:space="preserve"> p[job1] : 0)</w:t>
+        <w:t xml:space="preserve">                       + (t[job1] + t[job2] &gt; d[job1] ? p[job1] : 0)</w:t>
       </w:r>
     </w:p>
     <w:p>
@@ -7838,27 +7482,7 @@
           <w:sz w:val="18"/>
           <w:szCs w:val="18"/>
         </w:rPr>
-        <w:t>(</w:t>
-      </w:r>
-      <w:proofErr w:type="gramStart"/>
-      <w:r>
-        <w:rPr>
-          <w:rFonts w:ascii="Courier New" w:eastAsia="Courier New" w:hAnsi="Courier New" w:cs="Courier New"/>
-          <w:color w:val="1A1A1A"/>
-          <w:sz w:val="18"/>
-          <w:szCs w:val="18"/>
-        </w:rPr>
-        <w:t>job[</w:t>
-      </w:r>
-      <w:proofErr w:type="gramEnd"/>
-      <w:r>
-        <w:rPr>
-          <w:rFonts w:ascii="Courier New" w:eastAsia="Courier New" w:hAnsi="Courier New" w:cs="Courier New"/>
-          <w:color w:val="1A1A1A"/>
-          <w:sz w:val="18"/>
-          <w:szCs w:val="18"/>
-        </w:rPr>
-        <w:t>], l, r):</w:t>
+        <w:t>(job[], l, r):</w:t>
       </w:r>
     </w:p>
     <w:p>
@@ -7924,7 +7548,6 @@
         <w:t xml:space="preserve">    </w:t>
       </w:r>
       <w:proofErr w:type="spellStart"/>
-      <w:proofErr w:type="gramStart"/>
       <w:r>
         <w:rPr>
           <w:rFonts w:ascii="Courier New" w:eastAsia="Courier New" w:hAnsi="Courier New" w:cs="Courier New"/>
@@ -7942,17 +7565,7 @@
           <w:sz w:val="18"/>
           <w:szCs w:val="18"/>
         </w:rPr>
-        <w:t>(</w:t>
-      </w:r>
-      <w:proofErr w:type="gramEnd"/>
-      <w:r>
-        <w:rPr>
-          <w:rFonts w:ascii="Courier New" w:eastAsia="Courier New" w:hAnsi="Courier New" w:cs="Courier New"/>
-          <w:color w:val="1A1A1A"/>
-          <w:sz w:val="18"/>
-          <w:szCs w:val="18"/>
-        </w:rPr>
-        <w:t>job, l, mid)</w:t>
+        <w:t>(job, l, mid)</w:t>
       </w:r>
     </w:p>
     <w:p>
@@ -7973,7 +7586,6 @@
         <w:t xml:space="preserve">    </w:t>
       </w:r>
       <w:proofErr w:type="spellStart"/>
-      <w:proofErr w:type="gramStart"/>
       <w:r>
         <w:rPr>
           <w:rFonts w:ascii="Courier New" w:eastAsia="Courier New" w:hAnsi="Courier New" w:cs="Courier New"/>
@@ -7991,17 +7603,7 @@
           <w:sz w:val="18"/>
           <w:szCs w:val="18"/>
         </w:rPr>
-        <w:t>(</w:t>
-      </w:r>
-      <w:proofErr w:type="gramEnd"/>
-      <w:r>
-        <w:rPr>
-          <w:rFonts w:ascii="Courier New" w:eastAsia="Courier New" w:hAnsi="Courier New" w:cs="Courier New"/>
-          <w:color w:val="1A1A1A"/>
-          <w:sz w:val="18"/>
-          <w:szCs w:val="18"/>
-        </w:rPr>
-        <w:t>job, mid + 1, r)</w:t>
+        <w:t>(job, mid + 1, r)</w:t>
       </w:r>
     </w:p>
     <w:p>
@@ -8046,27 +7648,7 @@
           <w:sz w:val="18"/>
           <w:szCs w:val="18"/>
         </w:rPr>
-        <w:t xml:space="preserve">    </w:t>
-      </w:r>
-      <w:proofErr w:type="gramStart"/>
-      <w:r>
-        <w:rPr>
-          <w:rFonts w:ascii="Courier New" w:eastAsia="Courier New" w:hAnsi="Courier New" w:cs="Courier New"/>
-          <w:color w:val="1A1A1A"/>
-          <w:sz w:val="18"/>
-          <w:szCs w:val="18"/>
-        </w:rPr>
-        <w:t>temp[</w:t>
-      </w:r>
-      <w:proofErr w:type="gramEnd"/>
-      <w:r>
-        <w:rPr>
-          <w:rFonts w:ascii="Courier New" w:eastAsia="Courier New" w:hAnsi="Courier New" w:cs="Courier New"/>
-          <w:color w:val="1A1A1A"/>
-          <w:sz w:val="18"/>
-          <w:szCs w:val="18"/>
-        </w:rPr>
-        <w:t>] ← []</w:t>
+        <w:t xml:space="preserve">    temp[] ← []</w:t>
       </w:r>
     </w:p>
     <w:p>
@@ -8104,27 +7686,7 @@
           <w:sz w:val="18"/>
           <w:szCs w:val="18"/>
         </w:rPr>
-        <w:t xml:space="preserve"> ← </w:t>
-      </w:r>
-      <w:proofErr w:type="gramStart"/>
-      <w:r>
-        <w:rPr>
-          <w:rFonts w:ascii="Courier New" w:eastAsia="Courier New" w:hAnsi="Courier New" w:cs="Courier New"/>
-          <w:color w:val="1A1A1A"/>
-          <w:sz w:val="18"/>
-          <w:szCs w:val="18"/>
-        </w:rPr>
-        <w:t>l,  j</w:t>
-      </w:r>
-      <w:proofErr w:type="gramEnd"/>
-      <w:r>
-        <w:rPr>
-          <w:rFonts w:ascii="Courier New" w:eastAsia="Courier New" w:hAnsi="Courier New" w:cs="Courier New"/>
-          <w:color w:val="1A1A1A"/>
-          <w:sz w:val="18"/>
-          <w:szCs w:val="18"/>
-        </w:rPr>
-        <w:t xml:space="preserve"> ← mid + 1</w:t>
+        <w:t xml:space="preserve"> ← l,  j ← mid + 1</w:t>
       </w:r>
     </w:p>
     <w:p>
@@ -8250,7 +7812,6 @@
         <w:t xml:space="preserve">            </w:t>
       </w:r>
       <w:proofErr w:type="spellStart"/>
-      <w:proofErr w:type="gramStart"/>
       <w:r>
         <w:rPr>
           <w:rFonts w:ascii="Courier New" w:eastAsia="Courier New" w:hAnsi="Courier New" w:cs="Courier New"/>
@@ -8261,7 +7822,6 @@
         <w:t>temp.append</w:t>
       </w:r>
       <w:proofErr w:type="spellEnd"/>
-      <w:proofErr w:type="gramEnd"/>
       <w:r>
         <w:rPr>
           <w:rFonts w:ascii="Courier New" w:eastAsia="Courier New" w:hAnsi="Courier New" w:cs="Courier New"/>
@@ -8328,7 +7888,6 @@
         <w:t xml:space="preserve">            </w:t>
       </w:r>
       <w:proofErr w:type="spellStart"/>
-      <w:proofErr w:type="gramStart"/>
       <w:r>
         <w:rPr>
           <w:rFonts w:ascii="Courier New" w:eastAsia="Courier New" w:hAnsi="Courier New" w:cs="Courier New"/>
@@ -8339,7 +7898,6 @@
         <w:t>temp.append</w:t>
       </w:r>
       <w:proofErr w:type="spellEnd"/>
-      <w:proofErr w:type="gramEnd"/>
       <w:r>
         <w:rPr>
           <w:rFonts w:ascii="Courier New" w:eastAsia="Courier New" w:hAnsi="Courier New" w:cs="Courier New"/>
@@ -8417,7 +7975,6 @@
         <w:t xml:space="preserve"> &lt;= mid: </w:t>
       </w:r>
       <w:proofErr w:type="spellStart"/>
-      <w:proofErr w:type="gramStart"/>
       <w:r>
         <w:rPr>
           <w:rFonts w:ascii="Courier New" w:eastAsia="Courier New" w:hAnsi="Courier New" w:cs="Courier New"/>
@@ -8428,7 +7985,6 @@
         <w:t>temp.append</w:t>
       </w:r>
       <w:proofErr w:type="spellEnd"/>
-      <w:proofErr w:type="gramEnd"/>
       <w:r>
         <w:rPr>
           <w:rFonts w:ascii="Courier New" w:eastAsia="Courier New" w:hAnsi="Courier New" w:cs="Courier New"/>
@@ -8477,7 +8033,6 @@
         <w:t xml:space="preserve">    WHILE j &lt;= r:   </w:t>
       </w:r>
       <w:proofErr w:type="spellStart"/>
-      <w:proofErr w:type="gramStart"/>
       <w:r>
         <w:rPr>
           <w:rFonts w:ascii="Courier New" w:eastAsia="Courier New" w:hAnsi="Courier New" w:cs="Courier New"/>
@@ -8488,7 +8043,6 @@
         <w:t>temp.append</w:t>
       </w:r>
       <w:proofErr w:type="spellEnd"/>
-      <w:proofErr w:type="gramEnd"/>
       <w:r>
         <w:rPr>
           <w:rFonts w:ascii="Courier New" w:eastAsia="Courier New" w:hAnsi="Courier New" w:cs="Courier New"/>
@@ -8543,27 +8097,7 @@
           <w:sz w:val="18"/>
           <w:szCs w:val="18"/>
         </w:rPr>
-        <w:t xml:space="preserve">    Copy </w:t>
-      </w:r>
-      <w:proofErr w:type="gramStart"/>
-      <w:r>
-        <w:rPr>
-          <w:rFonts w:ascii="Courier New" w:eastAsia="Courier New" w:hAnsi="Courier New" w:cs="Courier New"/>
-          <w:color w:val="1A1A1A"/>
-          <w:sz w:val="18"/>
-          <w:szCs w:val="18"/>
-        </w:rPr>
-        <w:t>temp[</w:t>
-      </w:r>
-      <w:proofErr w:type="gramEnd"/>
-      <w:r>
-        <w:rPr>
-          <w:rFonts w:ascii="Courier New" w:eastAsia="Courier New" w:hAnsi="Courier New" w:cs="Courier New"/>
-          <w:color w:val="1A1A1A"/>
-          <w:sz w:val="18"/>
-          <w:szCs w:val="18"/>
-        </w:rPr>
-        <w:t>] back into job[</w:t>
+        <w:t xml:space="preserve">    Copy temp[] back into job[</w:t>
       </w:r>
       <w:proofErr w:type="spellStart"/>
       <w:r>
@@ -8646,27 +8180,7 @@
           <w:sz w:val="18"/>
           <w:szCs w:val="18"/>
         </w:rPr>
-        <w:t xml:space="preserve">    READ n, </w:t>
-      </w:r>
-      <w:proofErr w:type="gramStart"/>
-      <w:r>
-        <w:rPr>
-          <w:rFonts w:ascii="Courier New" w:eastAsia="Courier New" w:hAnsi="Courier New" w:cs="Courier New"/>
-          <w:color w:val="1A1A1A"/>
-          <w:sz w:val="18"/>
-          <w:szCs w:val="18"/>
-        </w:rPr>
-        <w:t>t[</w:t>
-      </w:r>
-      <w:proofErr w:type="gramEnd"/>
-      <w:r>
-        <w:rPr>
-          <w:rFonts w:ascii="Courier New" w:eastAsia="Courier New" w:hAnsi="Courier New" w:cs="Courier New"/>
-          <w:color w:val="1A1A1A"/>
-          <w:sz w:val="18"/>
-          <w:szCs w:val="18"/>
-        </w:rPr>
-        <w:t>], p[], d[]</w:t>
+        <w:t xml:space="preserve">    READ n, t[], p[], d[]</w:t>
       </w:r>
     </w:p>
     <w:p>
@@ -8684,27 +8198,7 @@
           <w:sz w:val="18"/>
           <w:szCs w:val="18"/>
         </w:rPr>
-        <w:t xml:space="preserve">    </w:t>
-      </w:r>
-      <w:proofErr w:type="gramStart"/>
-      <w:r>
-        <w:rPr>
-          <w:rFonts w:ascii="Courier New" w:eastAsia="Courier New" w:hAnsi="Courier New" w:cs="Courier New"/>
-          <w:color w:val="1A1A1A"/>
-          <w:sz w:val="18"/>
-          <w:szCs w:val="18"/>
-        </w:rPr>
-        <w:t>result[</w:t>
-      </w:r>
-      <w:proofErr w:type="gramEnd"/>
-      <w:r>
-        <w:rPr>
-          <w:rFonts w:ascii="Courier New" w:eastAsia="Courier New" w:hAnsi="Courier New" w:cs="Courier New"/>
-          <w:color w:val="1A1A1A"/>
-          <w:sz w:val="18"/>
-          <w:szCs w:val="18"/>
-        </w:rPr>
-        <w:t>] ← [0, 1, …, n-1]</w:t>
+        <w:t xml:space="preserve">    result[] ← [0, 1, …, n-1]</w:t>
       </w:r>
     </w:p>
     <w:p>
@@ -8725,7 +8219,6 @@
         <w:t xml:space="preserve">    </w:t>
       </w:r>
       <w:proofErr w:type="spellStart"/>
-      <w:proofErr w:type="gramStart"/>
       <w:r>
         <w:rPr>
           <w:rFonts w:ascii="Courier New" w:eastAsia="Courier New" w:hAnsi="Courier New" w:cs="Courier New"/>
@@ -8743,17 +8236,7 @@
           <w:sz w:val="18"/>
           <w:szCs w:val="18"/>
         </w:rPr>
-        <w:t>(</w:t>
-      </w:r>
-      <w:proofErr w:type="gramEnd"/>
-      <w:r>
-        <w:rPr>
-          <w:rFonts w:ascii="Courier New" w:eastAsia="Courier New" w:hAnsi="Courier New" w:cs="Courier New"/>
-          <w:color w:val="1A1A1A"/>
-          <w:sz w:val="18"/>
-          <w:szCs w:val="18"/>
-        </w:rPr>
-        <w:t>result, 0, n-1)</w:t>
+        <w:t>(result, 0, n-1)</w:t>
       </w:r>
     </w:p>
     <w:p>
@@ -8780,9 +8263,9 @@
           <w:sz w:val="18"/>
           <w:szCs w:val="18"/>
         </w:rPr>
-        <w:t xml:space="preserve">    time ← </w:t>
-      </w:r>
-      <w:proofErr w:type="gramStart"/>
+        <w:t xml:space="preserve">    time ← 0,  </w:t>
+      </w:r>
+      <w:proofErr w:type="spellStart"/>
       <w:r>
         <w:rPr>
           <w:rFonts w:ascii="Courier New" w:eastAsia="Courier New" w:hAnsi="Courier New" w:cs="Courier New"/>
@@ -8790,20 +8273,9 @@
           <w:sz w:val="18"/>
           <w:szCs w:val="18"/>
         </w:rPr>
-        <w:t xml:space="preserve">0,  </w:t>
-      </w:r>
-      <w:proofErr w:type="spellStart"/>
-      <w:r>
-        <w:rPr>
-          <w:rFonts w:ascii="Courier New" w:eastAsia="Courier New" w:hAnsi="Courier New" w:cs="Courier New"/>
-          <w:color w:val="1A1A1A"/>
-          <w:sz w:val="18"/>
-          <w:szCs w:val="18"/>
-        </w:rPr>
         <w:t>minPenalties</w:t>
       </w:r>
       <w:proofErr w:type="spellEnd"/>
-      <w:proofErr w:type="gramEnd"/>
       <w:r>
         <w:rPr>
           <w:rFonts w:ascii="Courier New" w:eastAsia="Courier New" w:hAnsi="Courier New" w:cs="Courier New"/>
@@ -9091,13 +8563,8 @@
       <w:pPr>
         <w:pStyle w:val="Heading2"/>
       </w:pPr>
-      <w:proofErr w:type="gramStart"/>
-      <w:r>
-        <w:t>4.4  Implementation</w:t>
-      </w:r>
-      <w:proofErr w:type="gramEnd"/>
-      <w:r>
-        <w:t xml:space="preserve"> Code (C++)</w:t>
+      <w:r>
+        <w:t>4.4  Implementation Code (C++)</w:t>
       </w:r>
     </w:p>
     <w:p>
@@ -9470,7 +8937,6 @@
         <w:t xml:space="preserve"> </w:t>
       </w:r>
       <w:proofErr w:type="spellStart"/>
-      <w:proofErr w:type="gramStart"/>
       <w:r>
         <w:rPr>
           <w:rFonts w:eastAsia="Times New Roman"/>
@@ -9486,7 +8952,6 @@
         </w:rPr>
         <w:t>(</w:t>
       </w:r>
-      <w:proofErr w:type="gramEnd"/>
       <w:r>
         <w:rPr>
           <w:rFonts w:eastAsia="Times New Roman"/>
@@ -9661,7 +9126,6 @@
         </w:rPr>
         <w:t>job_1</w:t>
       </w:r>
-      <w:proofErr w:type="gramStart"/>
       <w:r>
         <w:rPr>
           <w:rFonts w:eastAsia="Times New Roman"/>
@@ -9674,15 +9138,7 @@
           <w:rFonts w:eastAsia="Times New Roman"/>
           <w:color w:val="D4D4D4"/>
         </w:rPr>
-        <w:t xml:space="preserve"> ?</w:t>
-      </w:r>
-      <w:proofErr w:type="gramEnd"/>
-      <w:r>
-        <w:rPr>
-          <w:rFonts w:eastAsia="Times New Roman"/>
-          <w:color w:val="D4D4D4"/>
-        </w:rPr>
-        <w:t xml:space="preserve"> </w:t>
+        <w:t xml:space="preserve"> ? </w:t>
       </w:r>
       <w:r>
         <w:rPr>
@@ -9988,7 +9444,6 @@
         </w:rPr>
         <w:t>job_2</w:t>
       </w:r>
-      <w:proofErr w:type="gramStart"/>
       <w:r>
         <w:rPr>
           <w:rFonts w:eastAsia="Times New Roman"/>
@@ -10001,15 +9456,7 @@
           <w:rFonts w:eastAsia="Times New Roman"/>
           <w:color w:val="D4D4D4"/>
         </w:rPr>
-        <w:t xml:space="preserve"> ?</w:t>
-      </w:r>
-      <w:proofErr w:type="gramEnd"/>
-      <w:r>
-        <w:rPr>
-          <w:rFonts w:eastAsia="Times New Roman"/>
-          <w:color w:val="D4D4D4"/>
-        </w:rPr>
-        <w:t xml:space="preserve"> </w:t>
+        <w:t xml:space="preserve"> ? </w:t>
       </w:r>
       <w:r>
         <w:rPr>
@@ -10677,7 +10124,6 @@
         <w:t xml:space="preserve">    </w:t>
       </w:r>
       <w:proofErr w:type="spellStart"/>
-      <w:proofErr w:type="gramStart"/>
       <w:r>
         <w:rPr>
           <w:rFonts w:eastAsia="Times New Roman"/>
@@ -10693,7 +10139,6 @@
         </w:rPr>
         <w:t>(</w:t>
       </w:r>
-      <w:proofErr w:type="gramEnd"/>
       <w:r>
         <w:rPr>
           <w:rFonts w:eastAsia="Times New Roman"/>
@@ -10754,7 +10199,6 @@
         <w:t xml:space="preserve">    </w:t>
       </w:r>
       <w:proofErr w:type="spellStart"/>
-      <w:proofErr w:type="gramStart"/>
       <w:r>
         <w:rPr>
           <w:rFonts w:eastAsia="Times New Roman"/>
@@ -10770,7 +10214,6 @@
         </w:rPr>
         <w:t>(</w:t>
       </w:r>
-      <w:proofErr w:type="gramEnd"/>
       <w:r>
         <w:rPr>
           <w:rFonts w:eastAsia="Times New Roman"/>
@@ -11252,7 +10695,6 @@
         <w:t xml:space="preserve">            </w:t>
       </w:r>
       <w:proofErr w:type="spellStart"/>
-      <w:proofErr w:type="gramStart"/>
       <w:r>
         <w:rPr>
           <w:rFonts w:eastAsia="Times New Roman"/>
@@ -11272,15 +10714,7 @@
           <w:rFonts w:eastAsia="Times New Roman"/>
           <w:color w:val="DCDCAA"/>
         </w:rPr>
-        <w:t>push</w:t>
-      </w:r>
-      <w:proofErr w:type="gramEnd"/>
-      <w:r>
-        <w:rPr>
-          <w:rFonts w:eastAsia="Times New Roman"/>
-          <w:color w:val="DCDCAA"/>
-        </w:rPr>
-        <w:t>_back</w:t>
+        <w:t>push_back</w:t>
       </w:r>
       <w:proofErr w:type="spellEnd"/>
       <w:r>
@@ -11376,7 +10810,6 @@
         <w:t xml:space="preserve">            </w:t>
       </w:r>
       <w:proofErr w:type="spellStart"/>
-      <w:proofErr w:type="gramStart"/>
       <w:r>
         <w:rPr>
           <w:rFonts w:eastAsia="Times New Roman"/>
@@ -11396,15 +10829,7 @@
           <w:rFonts w:eastAsia="Times New Roman"/>
           <w:color w:val="DCDCAA"/>
         </w:rPr>
-        <w:t>push</w:t>
-      </w:r>
-      <w:proofErr w:type="gramEnd"/>
-      <w:r>
-        <w:rPr>
-          <w:rFonts w:eastAsia="Times New Roman"/>
-          <w:color w:val="DCDCAA"/>
-        </w:rPr>
-        <w:t>_back</w:t>
+        <w:t>push_back</w:t>
       </w:r>
       <w:proofErr w:type="spellEnd"/>
       <w:r>
@@ -11555,7 +10980,6 @@
         <w:t xml:space="preserve">        </w:t>
       </w:r>
       <w:proofErr w:type="spellStart"/>
-      <w:proofErr w:type="gramStart"/>
       <w:r>
         <w:rPr>
           <w:rFonts w:eastAsia="Times New Roman"/>
@@ -11575,15 +10999,7 @@
           <w:rFonts w:eastAsia="Times New Roman"/>
           <w:color w:val="DCDCAA"/>
         </w:rPr>
-        <w:t>push</w:t>
-      </w:r>
-      <w:proofErr w:type="gramEnd"/>
-      <w:r>
-        <w:rPr>
-          <w:rFonts w:eastAsia="Times New Roman"/>
-          <w:color w:val="DCDCAA"/>
-        </w:rPr>
-        <w:t>_back</w:t>
+        <w:t>push_back</w:t>
       </w:r>
       <w:proofErr w:type="spellEnd"/>
       <w:r>
@@ -11714,7 +11130,6 @@
         <w:t xml:space="preserve">        </w:t>
       </w:r>
       <w:proofErr w:type="spellStart"/>
-      <w:proofErr w:type="gramStart"/>
       <w:r>
         <w:rPr>
           <w:rFonts w:eastAsia="Times New Roman"/>
@@ -11734,15 +11149,7 @@
           <w:rFonts w:eastAsia="Times New Roman"/>
           <w:color w:val="DCDCAA"/>
         </w:rPr>
-        <w:t>push</w:t>
-      </w:r>
-      <w:proofErr w:type="gramEnd"/>
-      <w:r>
-        <w:rPr>
-          <w:rFonts w:eastAsia="Times New Roman"/>
-          <w:color w:val="DCDCAA"/>
-        </w:rPr>
-        <w:t>_back</w:t>
+        <w:t>push_back</w:t>
       </w:r>
       <w:proofErr w:type="spellEnd"/>
       <w:r>
@@ -11973,7 +11380,6 @@
         </w:rPr>
         <w:t xml:space="preserve"> = </w:t>
       </w:r>
-      <w:proofErr w:type="gramStart"/>
       <w:r>
         <w:rPr>
           <w:rFonts w:eastAsia="Times New Roman"/>
@@ -11988,7 +11394,6 @@
         </w:rPr>
         <w:t>[</w:t>
       </w:r>
-      <w:proofErr w:type="gramEnd"/>
       <w:r>
         <w:rPr>
           <w:rFonts w:eastAsia="Times New Roman"/>
@@ -12075,7 +11480,6 @@
         </w:rPr>
         <w:t xml:space="preserve"> </w:t>
       </w:r>
-      <w:proofErr w:type="gramStart"/>
       <w:r>
         <w:rPr>
           <w:rFonts w:eastAsia="Times New Roman"/>
@@ -12088,15 +11492,7 @@
           <w:rFonts w:eastAsia="Times New Roman"/>
           <w:color w:val="D4D4D4"/>
         </w:rPr>
-        <w:t>(</w:t>
-      </w:r>
-      <w:proofErr w:type="gramEnd"/>
-      <w:r>
-        <w:rPr>
-          <w:rFonts w:eastAsia="Times New Roman"/>
-          <w:color w:val="D4D4D4"/>
-        </w:rPr>
-        <w:t>)</w:t>
+        <w:t>()</w:t>
       </w:r>
     </w:p>
     <w:p>
@@ -12295,7 +11691,6 @@
         <w:t xml:space="preserve">    </w:t>
       </w:r>
       <w:proofErr w:type="spellStart"/>
-      <w:proofErr w:type="gramStart"/>
       <w:r>
         <w:rPr>
           <w:rFonts w:eastAsia="Times New Roman"/>
@@ -12318,7 +11713,6 @@
         <w:t>resize</w:t>
       </w:r>
       <w:proofErr w:type="spellEnd"/>
-      <w:proofErr w:type="gramEnd"/>
       <w:r>
         <w:rPr>
           <w:rFonts w:eastAsia="Times New Roman"/>
@@ -12358,7 +11752,6 @@
         <w:t xml:space="preserve">    </w:t>
       </w:r>
       <w:proofErr w:type="spellStart"/>
-      <w:proofErr w:type="gramStart"/>
       <w:r>
         <w:rPr>
           <w:rFonts w:eastAsia="Times New Roman"/>
@@ -12381,7 +11774,6 @@
         <w:t>resize</w:t>
       </w:r>
       <w:proofErr w:type="spellEnd"/>
-      <w:proofErr w:type="gramEnd"/>
       <w:r>
         <w:rPr>
           <w:rFonts w:eastAsia="Times New Roman"/>
@@ -13075,7 +12467,6 @@
         <w:t xml:space="preserve">    </w:t>
       </w:r>
       <w:proofErr w:type="spellStart"/>
-      <w:proofErr w:type="gramStart"/>
       <w:r>
         <w:rPr>
           <w:rFonts w:eastAsia="Times New Roman"/>
@@ -13091,7 +12482,6 @@
         </w:rPr>
         <w:t>(</w:t>
       </w:r>
-      <w:proofErr w:type="gramEnd"/>
       <w:r>
         <w:rPr>
           <w:rFonts w:eastAsia="Times New Roman"/>
@@ -13967,21 +13357,12 @@
         </w:rPr>
         <w:t xml:space="preserve"> </w:t>
       </w:r>
-      <w:proofErr w:type="gramStart"/>
       <w:r>
         <w:rPr>
           <w:rFonts w:eastAsia="Times New Roman"/>
           <w:color w:val="CE9178"/>
         </w:rPr>
-        <w:t>"  deadline</w:t>
-      </w:r>
-      <w:proofErr w:type="gramEnd"/>
-      <w:r>
-        <w:rPr>
-          <w:rFonts w:eastAsia="Times New Roman"/>
-          <w:color w:val="CE9178"/>
-        </w:rPr>
-        <w:t>: "</w:t>
+        <w:t>"  deadline: "</w:t>
       </w:r>
       <w:r>
         <w:rPr>
@@ -14305,13 +13686,8 @@
       <w:pPr>
         <w:pStyle w:val="Heading2"/>
       </w:pPr>
-      <w:proofErr w:type="gramStart"/>
-      <w:r>
-        <w:t>4.5  Test</w:t>
-      </w:r>
-      <w:proofErr w:type="gramEnd"/>
-      <w:r>
-        <w:t xml:space="preserve"> Cases</w:t>
+      <w:r>
+        <w:t>4.5  Test Cases</w:t>
       </w:r>
     </w:p>
     <w:p>
@@ -15057,15 +14433,7 @@
         <w:jc w:val="both"/>
       </w:pPr>
       <w:r>
-        <w:t xml:space="preserve">Job 3: cumulative time = 1 ≤ </w:t>
-      </w:r>
-      <w:proofErr w:type="gramStart"/>
-      <w:r>
-        <w:t>2  →</w:t>
-      </w:r>
-      <w:proofErr w:type="gramEnd"/>
-      <w:r>
-        <w:t xml:space="preserve"> no penalty</w:t>
+        <w:t>Job 3: cumulative time = 1 ≤ 2  → no penalty</w:t>
       </w:r>
     </w:p>
     <w:p>
@@ -15079,15 +14447,7 @@
         <w:jc w:val="both"/>
       </w:pPr>
       <w:r>
-        <w:t xml:space="preserve">Job 1: cumulative time = 4 ≤ </w:t>
-      </w:r>
-      <w:proofErr w:type="gramStart"/>
-      <w:r>
-        <w:t>4  →</w:t>
-      </w:r>
-      <w:proofErr w:type="gramEnd"/>
-      <w:r>
-        <w:t xml:space="preserve"> no penalty</w:t>
+        <w:t>Job 1: cumulative time = 4 ≤ 4  → no penalty</w:t>
       </w:r>
     </w:p>
     <w:p>
@@ -15101,15 +14461,7 @@
         <w:jc w:val="both"/>
       </w:pPr>
       <w:r>
-        <w:t xml:space="preserve">Job 2: cumulative time = 6 &gt; </w:t>
-      </w:r>
-      <w:proofErr w:type="gramStart"/>
-      <w:r>
-        <w:t>5  →</w:t>
-      </w:r>
-      <w:proofErr w:type="gramEnd"/>
-      <w:r>
-        <w:t xml:space="preserve"> penalty = 3</w:t>
+        <w:t>Job 2: cumulative time = 6 &gt; 5  → penalty = 3</w:t>
       </w:r>
     </w:p>
     <w:p>
@@ -15118,15 +14470,7 @@
         <w:jc w:val="both"/>
       </w:pPr>
       <w:r>
-        <w:t xml:space="preserve">Total Penalty = </w:t>
-      </w:r>
-      <w:proofErr w:type="gramStart"/>
-      <w:r>
-        <w:t>3  (</w:t>
-      </w:r>
-      <w:proofErr w:type="gramEnd"/>
-      <w:r>
-        <w:t>optimal)</w:t>
+        <w:t>Total Penalty = 3  (optimal)</w:t>
       </w:r>
     </w:p>
     <w:p>
@@ -16105,13 +15449,8 @@
       <w:pPr>
         <w:pStyle w:val="Heading2"/>
       </w:pPr>
-      <w:proofErr w:type="gramStart"/>
-      <w:r>
-        <w:t>4.6  Complexity</w:t>
-      </w:r>
-      <w:proofErr w:type="gramEnd"/>
-      <w:r>
-        <w:t xml:space="preserve"> Analysis</w:t>
+      <w:r>
+        <w:t>4.6  Complexity Analysis</w:t>
       </w:r>
     </w:p>
     <w:p>
@@ -16283,21 +15622,12 @@
             <w:pPr>
               <w:jc w:val="center"/>
             </w:pPr>
-            <w:proofErr w:type="gramStart"/>
             <w:r>
               <w:rPr>
                 <w:sz w:val="22"/>
                 <w:szCs w:val="22"/>
               </w:rPr>
-              <w:t>O(</w:t>
-            </w:r>
-            <w:proofErr w:type="gramEnd"/>
-            <w:r>
-              <w:rPr>
-                <w:sz w:val="22"/>
-                <w:szCs w:val="22"/>
-              </w:rPr>
-              <w:t>n log n) — Standard Merge Sort with an O(1) comparator per comparison</w:t>
+              <w:t>O(n log n) — Standard Merge Sort with an O(1) comparator per comparison</w:t>
             </w:r>
           </w:p>
         </w:tc>
@@ -16361,23 +15691,7 @@
                 <w:sz w:val="22"/>
                 <w:szCs w:val="22"/>
               </w:rPr>
-              <w:t xml:space="preserve">O(n) — Temporary array used during the merge step; </w:t>
-            </w:r>
-            <w:proofErr w:type="gramStart"/>
-            <w:r>
-              <w:rPr>
-                <w:sz w:val="22"/>
-                <w:szCs w:val="22"/>
-              </w:rPr>
-              <w:t>O(</w:t>
-            </w:r>
-            <w:proofErr w:type="gramEnd"/>
-            <w:r>
-              <w:rPr>
-                <w:sz w:val="22"/>
-                <w:szCs w:val="22"/>
-              </w:rPr>
-              <w:t>log n) recursion stack</w:t>
+              <w:t>O(n) — Temporary array used during the merge step; O(log n) recursion stack</w:t>
             </w:r>
           </w:p>
         </w:tc>
@@ -16415,12 +15729,10 @@
       <w:pPr>
         <w:pStyle w:val="Heading2"/>
       </w:pPr>
-      <w:proofErr w:type="gramStart"/>
       <w:r>
         <w:lastRenderedPageBreak/>
         <w:t>5.1  Methodology</w:t>
       </w:r>
-      <w:proofErr w:type="gramEnd"/>
     </w:p>
     <w:p>
       <w:pPr>
@@ -16435,13 +15747,8 @@
       <w:pPr>
         <w:pStyle w:val="Heading2"/>
       </w:pPr>
-      <w:proofErr w:type="gramStart"/>
-      <w:r>
-        <w:t>5.2  Step</w:t>
-      </w:r>
-      <w:proofErr w:type="gramEnd"/>
-      <w:r>
-        <w:t>-by-Step Description</w:t>
+      <w:r>
+        <w:t>5.2  Step-by-Step Description</w:t>
       </w:r>
     </w:p>
     <w:p>
@@ -16455,15 +15762,7 @@
         <w:jc w:val="both"/>
       </w:pPr>
       <w:r>
-        <w:t xml:space="preserve">Read n, and the arrays </w:t>
-      </w:r>
-      <w:proofErr w:type="gramStart"/>
-      <w:r>
-        <w:t>t[</w:t>
-      </w:r>
-      <w:proofErr w:type="gramEnd"/>
-      <w:r>
-        <w:t>], p[], d[].</w:t>
+        <w:t>Read n, and the arrays t[], p[], d[].</w:t>
       </w:r>
     </w:p>
     <w:p>
@@ -16494,17 +15793,12 @@
         <w:t xml:space="preserve">Initialize: </w:t>
       </w:r>
       <w:proofErr w:type="spellStart"/>
-      <w:proofErr w:type="gramStart"/>
       <w:r>
         <w:t>dp</w:t>
       </w:r>
       <w:proofErr w:type="spellEnd"/>
       <w:r>
-        <w:t>[</w:t>
-      </w:r>
-      <w:proofErr w:type="gramEnd"/>
-      <w:r>
-        <w:t xml:space="preserve">0] = 0 (no jobs scheduled → no penalty); all other </w:t>
+        <w:t xml:space="preserve">[0] = 0 (no jobs scheduled → no penalty); all other </w:t>
       </w:r>
       <w:proofErr w:type="spellStart"/>
       <w:r>
@@ -16613,13 +15907,8 @@
         <w:t>i</w:t>
       </w:r>
       <w:proofErr w:type="spellEnd"/>
-      <w:proofErr w:type="gramStart"/>
-      <w:r>
-        <w:t>] ?</w:t>
-      </w:r>
-      <w:proofErr w:type="gramEnd"/>
-      <w:r>
-        <w:t xml:space="preserve"> p[</w:t>
+      <w:r>
+        <w:t>] ? p[</w:t>
       </w:r>
       <w:proofErr w:type="spellStart"/>
       <w:r>
@@ -16701,19 +15990,11 @@
       </w:r>
       <w:proofErr w:type="spellStart"/>
       <w:r>
-        <w:t>last_</w:t>
-      </w:r>
-      <w:proofErr w:type="gramStart"/>
-      <w:r>
-        <w:t>state</w:t>
-      </w:r>
-      <w:proofErr w:type="spellEnd"/>
-      <w:r>
-        <w:t>[</w:t>
-      </w:r>
-      <w:proofErr w:type="gramEnd"/>
-      <w:r>
-        <w:t xml:space="preserve">] and </w:t>
+        <w:t>last_state</w:t>
+      </w:r>
+      <w:proofErr w:type="spellEnd"/>
+      <w:r>
+        <w:t xml:space="preserve">[] and </w:t>
       </w:r>
       <w:proofErr w:type="spellStart"/>
       <w:r>
@@ -16742,11 +16023,9 @@
       <w:pPr>
         <w:pStyle w:val="Heading2"/>
       </w:pPr>
-      <w:proofErr w:type="gramStart"/>
       <w:r>
         <w:t>5.3  Pseudocode</w:t>
       </w:r>
-      <w:proofErr w:type="gramEnd"/>
     </w:p>
     <w:p>
       <w:pPr>
@@ -16769,9 +16048,9 @@
           <w:sz w:val="18"/>
           <w:szCs w:val="18"/>
         </w:rPr>
-        <w:t>DP_</w:t>
-      </w:r>
-      <w:proofErr w:type="gramStart"/>
+        <w:t>DP_JobScheduling</w:t>
+      </w:r>
+      <w:proofErr w:type="spellEnd"/>
       <w:r>
         <w:rPr>
           <w:rFonts w:ascii="Courier New" w:eastAsia="Courier New" w:hAnsi="Courier New" w:cs="Courier New"/>
@@ -16779,27 +16058,7 @@
           <w:sz w:val="18"/>
           <w:szCs w:val="18"/>
         </w:rPr>
-        <w:t>JobScheduling</w:t>
-      </w:r>
-      <w:proofErr w:type="spellEnd"/>
-      <w:r>
-        <w:rPr>
-          <w:rFonts w:ascii="Courier New" w:eastAsia="Courier New" w:hAnsi="Courier New" w:cs="Courier New"/>
-          <w:color w:val="1A1A1A"/>
-          <w:sz w:val="18"/>
-          <w:szCs w:val="18"/>
-        </w:rPr>
-        <w:t>(</w:t>
-      </w:r>
-      <w:proofErr w:type="gramEnd"/>
-      <w:r>
-        <w:rPr>
-          <w:rFonts w:ascii="Courier New" w:eastAsia="Courier New" w:hAnsi="Courier New" w:cs="Courier New"/>
-          <w:color w:val="1A1A1A"/>
-          <w:sz w:val="18"/>
-          <w:szCs w:val="18"/>
-        </w:rPr>
-        <w:t>n, t[], p[], d[]):</w:t>
+        <w:t>(n, t[], p[], d[]):</w:t>
       </w:r>
     </w:p>
     <w:p>
@@ -16858,7 +16117,6 @@
         <w:t xml:space="preserve">    </w:t>
       </w:r>
       <w:proofErr w:type="spellStart"/>
-      <w:proofErr w:type="gramStart"/>
       <w:r>
         <w:rPr>
           <w:rFonts w:ascii="Courier New" w:eastAsia="Courier New" w:hAnsi="Courier New" w:cs="Courier New"/>
@@ -16876,17 +16134,7 @@
           <w:sz w:val="18"/>
           <w:szCs w:val="18"/>
         </w:rPr>
-        <w:t>[</w:t>
-      </w:r>
-      <w:proofErr w:type="gramEnd"/>
-      <w:r>
-        <w:rPr>
-          <w:rFonts w:ascii="Courier New" w:eastAsia="Courier New" w:hAnsi="Courier New" w:cs="Courier New"/>
-          <w:color w:val="1A1A1A"/>
-          <w:sz w:val="18"/>
-          <w:szCs w:val="18"/>
-        </w:rPr>
-        <w:t>]          ← array[</w:t>
+        <w:t>[]          ← array[</w:t>
       </w:r>
       <w:proofErr w:type="spellStart"/>
       <w:r>
@@ -16927,7 +16175,6 @@
         <w:t xml:space="preserve">    </w:t>
       </w:r>
       <w:proofErr w:type="spellStart"/>
-      <w:proofErr w:type="gramStart"/>
       <w:r>
         <w:rPr>
           <w:rFonts w:ascii="Courier New" w:eastAsia="Courier New" w:hAnsi="Courier New" w:cs="Courier New"/>
@@ -16945,17 +16192,7 @@
           <w:sz w:val="18"/>
           <w:szCs w:val="18"/>
         </w:rPr>
-        <w:t>[</w:t>
-      </w:r>
-      <w:proofErr w:type="gramEnd"/>
-      <w:r>
-        <w:rPr>
-          <w:rFonts w:ascii="Courier New" w:eastAsia="Courier New" w:hAnsi="Courier New" w:cs="Courier New"/>
-          <w:color w:val="1A1A1A"/>
-          <w:sz w:val="18"/>
-          <w:szCs w:val="18"/>
-        </w:rPr>
-        <w:t>]    ← array[</w:t>
+        <w:t>[]    ← array[</w:t>
       </w:r>
       <w:proofErr w:type="spellStart"/>
       <w:r>
@@ -17003,9 +16240,9 @@
           <w:sz w:val="18"/>
           <w:szCs w:val="18"/>
         </w:rPr>
-        <w:t>last_</w:t>
-      </w:r>
-      <w:proofErr w:type="gramStart"/>
+        <w:t>last_state</w:t>
+      </w:r>
+      <w:proofErr w:type="spellEnd"/>
       <w:r>
         <w:rPr>
           <w:rFonts w:ascii="Courier New" w:eastAsia="Courier New" w:hAnsi="Courier New" w:cs="Courier New"/>
@@ -17013,27 +16250,7 @@
           <w:sz w:val="18"/>
           <w:szCs w:val="18"/>
         </w:rPr>
-        <w:t>state</w:t>
-      </w:r>
-      <w:proofErr w:type="spellEnd"/>
-      <w:r>
-        <w:rPr>
-          <w:rFonts w:ascii="Courier New" w:eastAsia="Courier New" w:hAnsi="Courier New" w:cs="Courier New"/>
-          <w:color w:val="1A1A1A"/>
-          <w:sz w:val="18"/>
-          <w:szCs w:val="18"/>
-        </w:rPr>
-        <w:t>[</w:t>
-      </w:r>
-      <w:proofErr w:type="gramEnd"/>
-      <w:r>
-        <w:rPr>
-          <w:rFonts w:ascii="Courier New" w:eastAsia="Courier New" w:hAnsi="Courier New" w:cs="Courier New"/>
-          <w:color w:val="1A1A1A"/>
-          <w:sz w:val="18"/>
-          <w:szCs w:val="18"/>
-        </w:rPr>
-        <w:t>]  ← array[</w:t>
+        <w:t>[]  ← array[</w:t>
       </w:r>
       <w:proofErr w:type="spellStart"/>
       <w:r>
@@ -17081,9 +16298,9 @@
           <w:sz w:val="18"/>
           <w:szCs w:val="18"/>
         </w:rPr>
-        <w:t>last_</w:t>
-      </w:r>
-      <w:proofErr w:type="gramStart"/>
+        <w:t>last_Job</w:t>
+      </w:r>
+      <w:proofErr w:type="spellEnd"/>
       <w:r>
         <w:rPr>
           <w:rFonts w:ascii="Courier New" w:eastAsia="Courier New" w:hAnsi="Courier New" w:cs="Courier New"/>
@@ -17091,27 +16308,7 @@
           <w:sz w:val="18"/>
           <w:szCs w:val="18"/>
         </w:rPr>
-        <w:t>Job</w:t>
-      </w:r>
-      <w:proofErr w:type="spellEnd"/>
-      <w:r>
-        <w:rPr>
-          <w:rFonts w:ascii="Courier New" w:eastAsia="Courier New" w:hAnsi="Courier New" w:cs="Courier New"/>
-          <w:color w:val="1A1A1A"/>
-          <w:sz w:val="18"/>
-          <w:szCs w:val="18"/>
-        </w:rPr>
-        <w:t>[</w:t>
-      </w:r>
-      <w:proofErr w:type="gramEnd"/>
-      <w:r>
-        <w:rPr>
-          <w:rFonts w:ascii="Courier New" w:eastAsia="Courier New" w:hAnsi="Courier New" w:cs="Courier New"/>
-          <w:color w:val="1A1A1A"/>
-          <w:sz w:val="18"/>
-          <w:szCs w:val="18"/>
-        </w:rPr>
-        <w:t>]    ← array[</w:t>
+        <w:t>[]    ← array[</w:t>
       </w:r>
       <w:proofErr w:type="spellStart"/>
       <w:r>
@@ -17161,7 +16358,6 @@
         <w:t xml:space="preserve">    </w:t>
       </w:r>
       <w:proofErr w:type="spellStart"/>
-      <w:proofErr w:type="gramStart"/>
       <w:r>
         <w:rPr>
           <w:rFonts w:ascii="Courier New" w:eastAsia="Courier New" w:hAnsi="Courier New" w:cs="Courier New"/>
@@ -17179,17 +16375,7 @@
           <w:sz w:val="18"/>
           <w:szCs w:val="18"/>
         </w:rPr>
-        <w:t>[</w:t>
-      </w:r>
-      <w:proofErr w:type="gramEnd"/>
-      <w:r>
-        <w:rPr>
-          <w:rFonts w:ascii="Courier New" w:eastAsia="Courier New" w:hAnsi="Courier New" w:cs="Courier New"/>
-          <w:color w:val="1A1A1A"/>
-          <w:sz w:val="18"/>
-          <w:szCs w:val="18"/>
-        </w:rPr>
-        <w:t>0] ← 0</w:t>
+        <w:t>[0] ← 0</w:t>
       </w:r>
     </w:p>
     <w:p>
@@ -17615,7 +16801,6 @@
         <w:t>i</w:t>
       </w:r>
       <w:proofErr w:type="spellEnd"/>
-      <w:proofErr w:type="gramStart"/>
       <w:r>
         <w:rPr>
           <w:rFonts w:ascii="Courier New" w:eastAsia="Courier New" w:hAnsi="Courier New" w:cs="Courier New"/>
@@ -17623,17 +16808,7 @@
           <w:sz w:val="18"/>
           <w:szCs w:val="18"/>
         </w:rPr>
-        <w:t>] ?</w:t>
-      </w:r>
-      <w:proofErr w:type="gramEnd"/>
-      <w:r>
-        <w:rPr>
-          <w:rFonts w:ascii="Courier New" w:eastAsia="Courier New" w:hAnsi="Courier New" w:cs="Courier New"/>
-          <w:color w:val="1A1A1A"/>
-          <w:sz w:val="18"/>
-          <w:szCs w:val="18"/>
-        </w:rPr>
-        <w:t xml:space="preserve"> p[</w:t>
+        <w:t>] ? p[</w:t>
       </w:r>
       <w:proofErr w:type="spellStart"/>
       <w:r>
@@ -17781,7 +16956,6 @@
         <w:t>[</w:t>
       </w:r>
       <w:proofErr w:type="spellStart"/>
-      <w:proofErr w:type="gramStart"/>
       <w:r>
         <w:rPr>
           <w:rFonts w:ascii="Courier New" w:eastAsia="Courier New" w:hAnsi="Courier New" w:cs="Courier New"/>
@@ -17799,17 +16973,7 @@
           <w:sz w:val="18"/>
           <w:szCs w:val="18"/>
         </w:rPr>
-        <w:t xml:space="preserve">]   </w:t>
-      </w:r>
-      <w:proofErr w:type="gramEnd"/>
-      <w:r>
-        <w:rPr>
-          <w:rFonts w:ascii="Courier New" w:eastAsia="Courier New" w:hAnsi="Courier New" w:cs="Courier New"/>
-          <w:color w:val="1A1A1A"/>
-          <w:sz w:val="18"/>
-          <w:szCs w:val="18"/>
-        </w:rPr>
-        <w:t xml:space="preserve">      ← </w:t>
+        <w:t xml:space="preserve">]         ← </w:t>
       </w:r>
       <w:proofErr w:type="spellStart"/>
       <w:r>
@@ -17861,7 +17025,6 @@
         <w:t>[</w:t>
       </w:r>
       <w:proofErr w:type="spellStart"/>
-      <w:proofErr w:type="gramStart"/>
       <w:r>
         <w:rPr>
           <w:rFonts w:ascii="Courier New" w:eastAsia="Courier New" w:hAnsi="Courier New" w:cs="Courier New"/>
@@ -17879,17 +17042,7 @@
           <w:sz w:val="18"/>
           <w:szCs w:val="18"/>
         </w:rPr>
-        <w:t xml:space="preserve">]   </w:t>
-      </w:r>
-      <w:proofErr w:type="gramEnd"/>
-      <w:r>
-        <w:rPr>
-          <w:rFonts w:ascii="Courier New" w:eastAsia="Courier New" w:hAnsi="Courier New" w:cs="Courier New"/>
-          <w:color w:val="1A1A1A"/>
-          <w:sz w:val="18"/>
-          <w:szCs w:val="18"/>
-        </w:rPr>
-        <w:t xml:space="preserve">← </w:t>
+        <w:t xml:space="preserve">]   ← </w:t>
       </w:r>
       <w:proofErr w:type="spellStart"/>
       <w:r>
@@ -17999,7 +17152,6 @@
         <w:t>[</w:t>
       </w:r>
       <w:proofErr w:type="spellStart"/>
-      <w:proofErr w:type="gramStart"/>
       <w:r>
         <w:rPr>
           <w:rFonts w:ascii="Courier New" w:eastAsia="Courier New" w:hAnsi="Courier New" w:cs="Courier New"/>
@@ -18017,17 +17169,7 @@
           <w:sz w:val="18"/>
           <w:szCs w:val="18"/>
         </w:rPr>
-        <w:t xml:space="preserve">]   </w:t>
-      </w:r>
-      <w:proofErr w:type="gramEnd"/>
-      <w:r>
-        <w:rPr>
-          <w:rFonts w:ascii="Courier New" w:eastAsia="Courier New" w:hAnsi="Courier New" w:cs="Courier New"/>
-          <w:color w:val="1A1A1A"/>
-          <w:sz w:val="18"/>
-          <w:szCs w:val="18"/>
-        </w:rPr>
-        <w:t xml:space="preserve">← </w:t>
+        <w:t xml:space="preserve">]   ← </w:t>
       </w:r>
       <w:proofErr w:type="spellStart"/>
       <w:r>
@@ -18083,27 +17225,7 @@
           <w:sz w:val="18"/>
           <w:szCs w:val="18"/>
         </w:rPr>
-        <w:t xml:space="preserve">    </w:t>
-      </w:r>
-      <w:proofErr w:type="gramStart"/>
-      <w:r>
-        <w:rPr>
-          <w:rFonts w:ascii="Courier New" w:eastAsia="Courier New" w:hAnsi="Courier New" w:cs="Courier New"/>
-          <w:color w:val="1A1A1A"/>
-          <w:sz w:val="18"/>
-          <w:szCs w:val="18"/>
-        </w:rPr>
-        <w:t>result[</w:t>
-      </w:r>
-      <w:proofErr w:type="gramEnd"/>
-      <w:r>
-        <w:rPr>
-          <w:rFonts w:ascii="Courier New" w:eastAsia="Courier New" w:hAnsi="Courier New" w:cs="Courier New"/>
-          <w:color w:val="1A1A1A"/>
-          <w:sz w:val="18"/>
-          <w:szCs w:val="18"/>
-        </w:rPr>
-        <w:t>]  ← []</w:t>
+        <w:t xml:space="preserve">    result[]  ← []</w:t>
       </w:r>
     </w:p>
     <w:p>
@@ -18181,7 +17303,6 @@
         <w:t xml:space="preserve">        </w:t>
       </w:r>
       <w:proofErr w:type="spellStart"/>
-      <w:proofErr w:type="gramStart"/>
       <w:r>
         <w:rPr>
           <w:rFonts w:ascii="Courier New" w:eastAsia="Courier New" w:hAnsi="Courier New" w:cs="Courier New"/>
@@ -18192,7 +17313,6 @@
         <w:t>result.prepend</w:t>
       </w:r>
       <w:proofErr w:type="spellEnd"/>
-      <w:proofErr w:type="gramEnd"/>
       <w:r>
         <w:rPr>
           <w:rFonts w:ascii="Courier New" w:eastAsia="Courier New" w:hAnsi="Courier New" w:cs="Courier New"/>
@@ -18285,9 +17405,9 @@
           <w:sz w:val="18"/>
           <w:szCs w:val="18"/>
         </w:rPr>
-        <w:t xml:space="preserve">    PRINT </w:t>
-      </w:r>
-      <w:proofErr w:type="gramStart"/>
+        <w:t xml:space="preserve">    PRINT result[], </w:t>
+      </w:r>
+      <w:proofErr w:type="spellStart"/>
       <w:r>
         <w:rPr>
           <w:rFonts w:ascii="Courier New" w:eastAsia="Courier New" w:hAnsi="Courier New" w:cs="Courier New"/>
@@ -18295,9 +17415,9 @@
           <w:sz w:val="18"/>
           <w:szCs w:val="18"/>
         </w:rPr>
-        <w:t>result[</w:t>
-      </w:r>
-      <w:proofErr w:type="gramEnd"/>
+        <w:t>dp</w:t>
+      </w:r>
+      <w:proofErr w:type="spellEnd"/>
       <w:r>
         <w:rPr>
           <w:rFonts w:ascii="Courier New" w:eastAsia="Courier New" w:hAnsi="Courier New" w:cs="Courier New"/>
@@ -18305,7 +17425,7 @@
           <w:sz w:val="18"/>
           <w:szCs w:val="18"/>
         </w:rPr>
-        <w:t xml:space="preserve">], </w:t>
+        <w:t>[</w:t>
       </w:r>
       <w:proofErr w:type="spellStart"/>
       <w:r>
@@ -18315,7 +17435,7 @@
           <w:sz w:val="18"/>
           <w:szCs w:val="18"/>
         </w:rPr>
-        <w:t>dp</w:t>
+        <w:t>totalStates</w:t>
       </w:r>
       <w:proofErr w:type="spellEnd"/>
       <w:r>
@@ -18325,26 +17445,6 @@
           <w:sz w:val="18"/>
           <w:szCs w:val="18"/>
         </w:rPr>
-        <w:t>[</w:t>
-      </w:r>
-      <w:proofErr w:type="spellStart"/>
-      <w:r>
-        <w:rPr>
-          <w:rFonts w:ascii="Courier New" w:eastAsia="Courier New" w:hAnsi="Courier New" w:cs="Courier New"/>
-          <w:color w:val="1A1A1A"/>
-          <w:sz w:val="18"/>
-          <w:szCs w:val="18"/>
-        </w:rPr>
-        <w:t>totalStates</w:t>
-      </w:r>
-      <w:proofErr w:type="spellEnd"/>
-      <w:r>
-        <w:rPr>
-          <w:rFonts w:ascii="Courier New" w:eastAsia="Courier New" w:hAnsi="Courier New" w:cs="Courier New"/>
-          <w:color w:val="1A1A1A"/>
-          <w:sz w:val="18"/>
-          <w:szCs w:val="18"/>
-        </w:rPr>
         <w:t xml:space="preserve"> - 1]</w:t>
       </w:r>
     </w:p>
@@ -18357,13 +17457,8 @@
       <w:pPr>
         <w:pStyle w:val="Heading2"/>
       </w:pPr>
-      <w:proofErr w:type="gramStart"/>
-      <w:r>
-        <w:t>5.4  Implementation</w:t>
-      </w:r>
-      <w:proofErr w:type="gramEnd"/>
-      <w:r>
-        <w:t xml:space="preserve"> Code (C++)</w:t>
+      <w:r>
+        <w:t>5.4  Implementation Code (C++)</w:t>
       </w:r>
     </w:p>
     <w:p>
@@ -18596,7 +17691,6 @@
         </w:rPr>
         <w:t xml:space="preserve"> </w:t>
       </w:r>
-      <w:proofErr w:type="gramStart"/>
       <w:r>
         <w:rPr>
           <w:rFonts w:eastAsia="Times New Roman"/>
@@ -18609,15 +17703,7 @@
           <w:rFonts w:eastAsia="Times New Roman"/>
           <w:color w:val="D4D4D4"/>
         </w:rPr>
-        <w:t>(</w:t>
-      </w:r>
-      <w:proofErr w:type="gramEnd"/>
-      <w:r>
-        <w:rPr>
-          <w:rFonts w:eastAsia="Times New Roman"/>
-          <w:color w:val="D4D4D4"/>
-        </w:rPr>
-        <w:t>)</w:t>
+        <w:t>()</w:t>
       </w:r>
     </w:p>
     <w:p>
@@ -19265,7 +18351,6 @@
         <w:t xml:space="preserve">&gt; </w:t>
       </w:r>
       <w:proofErr w:type="spellStart"/>
-      <w:proofErr w:type="gramStart"/>
       <w:r>
         <w:rPr>
           <w:rFonts w:eastAsia="Times New Roman"/>
@@ -19282,7 +18367,6 @@
         <w:t>(</w:t>
       </w:r>
       <w:proofErr w:type="spellStart"/>
-      <w:proofErr w:type="gramEnd"/>
       <w:r>
         <w:rPr>
           <w:rFonts w:eastAsia="Times New Roman"/>
@@ -19363,15 +18447,7 @@
           <w:rFonts w:eastAsia="Times New Roman"/>
           <w:color w:val="9CDCFE"/>
         </w:rPr>
-        <w:t>last_</w:t>
-      </w:r>
-      <w:proofErr w:type="gramStart"/>
-      <w:r>
-        <w:rPr>
-          <w:rFonts w:eastAsia="Times New Roman"/>
-          <w:color w:val="9CDCFE"/>
-        </w:rPr>
-        <w:t>state</w:t>
+        <w:t>last_state</w:t>
       </w:r>
       <w:proofErr w:type="spellEnd"/>
       <w:r>
@@ -19382,7 +18458,6 @@
         <w:t>(</w:t>
       </w:r>
       <w:proofErr w:type="spellStart"/>
-      <w:proofErr w:type="gramEnd"/>
       <w:r>
         <w:rPr>
           <w:rFonts w:eastAsia="Times New Roman"/>
@@ -19463,15 +18538,7 @@
           <w:rFonts w:eastAsia="Times New Roman"/>
           <w:color w:val="9CDCFE"/>
         </w:rPr>
-        <w:t>last_</w:t>
-      </w:r>
-      <w:proofErr w:type="gramStart"/>
-      <w:r>
-        <w:rPr>
-          <w:rFonts w:eastAsia="Times New Roman"/>
-          <w:color w:val="9CDCFE"/>
-        </w:rPr>
-        <w:t>Job</w:t>
+        <w:t>last_Job</w:t>
       </w:r>
       <w:proofErr w:type="spellEnd"/>
       <w:r>
@@ -19482,7 +18549,6 @@
         <w:t>(</w:t>
       </w:r>
       <w:proofErr w:type="spellStart"/>
-      <w:proofErr w:type="gramEnd"/>
       <w:r>
         <w:rPr>
           <w:rFonts w:eastAsia="Times New Roman"/>
@@ -19558,7 +18624,6 @@
         <w:t xml:space="preserve">&gt; </w:t>
       </w:r>
       <w:proofErr w:type="spellStart"/>
-      <w:proofErr w:type="gramStart"/>
       <w:r>
         <w:rPr>
           <w:rFonts w:eastAsia="Times New Roman"/>
@@ -19575,7 +18640,6 @@
         <w:t>(</w:t>
       </w:r>
       <w:proofErr w:type="spellStart"/>
-      <w:proofErr w:type="gramEnd"/>
       <w:r>
         <w:rPr>
           <w:rFonts w:eastAsia="Times New Roman"/>
@@ -19950,7 +19014,6 @@
         <w:t xml:space="preserve">    </w:t>
       </w:r>
       <w:proofErr w:type="spellStart"/>
-      <w:proofErr w:type="gramStart"/>
       <w:r>
         <w:rPr>
           <w:rFonts w:eastAsia="Times New Roman"/>
@@ -19966,7 +19029,6 @@
         </w:rPr>
         <w:t>[</w:t>
       </w:r>
-      <w:proofErr w:type="gramEnd"/>
       <w:r>
         <w:rPr>
           <w:rFonts w:eastAsia="Times New Roman"/>
@@ -21682,7 +20744,6 @@
         </w:rPr>
         <w:t xml:space="preserve"> (</w:t>
       </w:r>
-      <w:proofErr w:type="gramStart"/>
       <w:r>
         <w:rPr>
           <w:rFonts w:eastAsia="Times New Roman"/>
@@ -21695,15 +20756,7 @@
           <w:rFonts w:eastAsia="Times New Roman"/>
           <w:color w:val="D4D4D4"/>
         </w:rPr>
-        <w:t xml:space="preserve"> !</w:t>
-      </w:r>
-      <w:proofErr w:type="gramEnd"/>
-      <w:r>
-        <w:rPr>
-          <w:rFonts w:eastAsia="Times New Roman"/>
-          <w:color w:val="D4D4D4"/>
-        </w:rPr>
-        <w:t xml:space="preserve">= </w:t>
+        <w:t xml:space="preserve"> != </w:t>
       </w:r>
       <w:r>
         <w:rPr>
@@ -21754,7 +20807,6 @@
         <w:t xml:space="preserve">        </w:t>
       </w:r>
       <w:proofErr w:type="spellStart"/>
-      <w:proofErr w:type="gramStart"/>
       <w:r>
         <w:rPr>
           <w:rFonts w:eastAsia="Times New Roman"/>
@@ -21774,15 +20826,7 @@
           <w:rFonts w:eastAsia="Times New Roman"/>
           <w:color w:val="DCDCAA"/>
         </w:rPr>
-        <w:t>push</w:t>
-      </w:r>
-      <w:proofErr w:type="gramEnd"/>
-      <w:r>
-        <w:rPr>
-          <w:rFonts w:eastAsia="Times New Roman"/>
-          <w:color w:val="DCDCAA"/>
-        </w:rPr>
-        <w:t>_back</w:t>
+        <w:t>push_back</w:t>
       </w:r>
       <w:proofErr w:type="spellEnd"/>
       <w:r>
@@ -21947,7 +20991,6 @@
         <w:t>(</w:t>
       </w:r>
       <w:proofErr w:type="spellStart"/>
-      <w:proofErr w:type="gramStart"/>
       <w:r>
         <w:rPr>
           <w:rFonts w:eastAsia="Times New Roman"/>
@@ -21970,7 +21013,6 @@
         <w:t>begin</w:t>
       </w:r>
       <w:proofErr w:type="spellEnd"/>
-      <w:proofErr w:type="gramEnd"/>
       <w:r>
         <w:rPr>
           <w:rFonts w:eastAsia="Times New Roman"/>
@@ -23017,7 +22059,6 @@
         </w:rPr>
         <w:t xml:space="preserve"> </w:t>
       </w:r>
-      <w:proofErr w:type="gramStart"/>
       <w:r>
         <w:rPr>
           <w:rFonts w:eastAsia="Times New Roman"/>
@@ -23025,7 +22066,6 @@
         </w:rPr>
         <w:t>"  "</w:t>
       </w:r>
-      <w:proofErr w:type="gramEnd"/>
     </w:p>
     <w:p>
       <w:pPr>
@@ -23386,13 +22426,8 @@
       <w:pPr>
         <w:pStyle w:val="Heading2"/>
       </w:pPr>
-      <w:proofErr w:type="gramStart"/>
-      <w:r>
-        <w:t>5.5  Test</w:t>
-      </w:r>
-      <w:proofErr w:type="gramEnd"/>
-      <w:r>
-        <w:t xml:space="preserve"> Cases</w:t>
+      <w:r>
+        <w:t>5.5  Test Cases</w:t>
       </w:r>
     </w:p>
     <w:p>
@@ -24117,15 +23152,7 @@
       </w:pPr>
       <w:r>
         <w:lastRenderedPageBreak/>
-        <w:t xml:space="preserve">Job 3: cumulative time = 1 ≤ </w:t>
-      </w:r>
-      <w:proofErr w:type="gramStart"/>
-      <w:r>
-        <w:t>2  →</w:t>
-      </w:r>
-      <w:proofErr w:type="gramEnd"/>
-      <w:r>
-        <w:t xml:space="preserve"> no penalty</w:t>
+        <w:t>Job 3: cumulative time = 1 ≤ 2  → no penalty</w:t>
       </w:r>
     </w:p>
     <w:p>
@@ -24139,15 +23166,7 @@
         <w:jc w:val="both"/>
       </w:pPr>
       <w:r>
-        <w:t xml:space="preserve">Job 1: cumulative time = 4 ≤ </w:t>
-      </w:r>
-      <w:proofErr w:type="gramStart"/>
-      <w:r>
-        <w:t>4  →</w:t>
-      </w:r>
-      <w:proofErr w:type="gramEnd"/>
-      <w:r>
-        <w:t xml:space="preserve"> no penalty</w:t>
+        <w:t>Job 1: cumulative time = 4 ≤ 4  → no penalty</w:t>
       </w:r>
     </w:p>
     <w:p>
@@ -24161,15 +23180,7 @@
         <w:jc w:val="both"/>
       </w:pPr>
       <w:r>
-        <w:t xml:space="preserve">Job 2: cumulative time = 6 &gt; </w:t>
-      </w:r>
-      <w:proofErr w:type="gramStart"/>
-      <w:r>
-        <w:t>5  →</w:t>
-      </w:r>
-      <w:proofErr w:type="gramEnd"/>
-      <w:r>
-        <w:t xml:space="preserve"> penalty = 3</w:t>
+        <w:t>Job 2: cumulative time = 6 &gt; 5  → penalty = 3</w:t>
       </w:r>
     </w:p>
     <w:p>
@@ -24178,15 +23189,7 @@
         <w:jc w:val="both"/>
       </w:pPr>
       <w:r>
-        <w:t xml:space="preserve">Total Penalty = </w:t>
-      </w:r>
-      <w:proofErr w:type="gramStart"/>
-      <w:r>
-        <w:t>3  (</w:t>
-      </w:r>
-      <w:proofErr w:type="gramEnd"/>
-      <w:r>
-        <w:t>optimal)</w:t>
+        <w:t>Total Penalty = 3  (optimal)</w:t>
       </w:r>
     </w:p>
     <w:p>
@@ -25165,14 +24168,9 @@
       <w:pPr>
         <w:pStyle w:val="Heading2"/>
       </w:pPr>
-      <w:proofErr w:type="gramStart"/>
       <w:r>
         <w:lastRenderedPageBreak/>
-        <w:t>5.6  Complexity</w:t>
-      </w:r>
-      <w:proofErr w:type="gramEnd"/>
-      <w:r>
-        <w:t xml:space="preserve"> Analysis</w:t>
+        <w:t>5.6  Complexity Analysis</w:t>
       </w:r>
     </w:p>
     <w:p>
@@ -25344,21 +24342,12 @@
             <w:pPr>
               <w:jc w:val="center"/>
             </w:pPr>
-            <w:proofErr w:type="gramStart"/>
             <w:r>
               <w:rPr>
                 <w:sz w:val="22"/>
                 <w:szCs w:val="22"/>
               </w:rPr>
-              <w:t>O(</w:t>
-            </w:r>
-            <w:proofErr w:type="gramEnd"/>
-            <w:r>
-              <w:rPr>
-                <w:sz w:val="22"/>
-                <w:szCs w:val="22"/>
-              </w:rPr>
-              <w:t>2ⁿ × n) — 2ⁿ states × n transitions per state</w:t>
+              <w:t>O(2ⁿ × n) — 2ⁿ states × n transitions per state</w:t>
             </w:r>
           </w:p>
         </w:tc>
@@ -25425,7 +24414,6 @@
               <w:t xml:space="preserve">O(2ⁿ) — Arrays </w:t>
             </w:r>
             <w:proofErr w:type="spellStart"/>
-            <w:proofErr w:type="gramStart"/>
             <w:r>
               <w:rPr>
                 <w:sz w:val="22"/>
@@ -25439,15 +24427,7 @@
                 <w:sz w:val="22"/>
                 <w:szCs w:val="22"/>
               </w:rPr>
-              <w:t>[</w:t>
-            </w:r>
-            <w:proofErr w:type="gramEnd"/>
-            <w:r>
-              <w:rPr>
-                <w:sz w:val="22"/>
-                <w:szCs w:val="22"/>
-              </w:rPr>
-              <w:t xml:space="preserve">], </w:t>
+              <w:t xml:space="preserve">[], </w:t>
             </w:r>
             <w:proofErr w:type="spellStart"/>
             <w:r>
@@ -25684,20 +24664,8 @@
                 <w:sz w:val="20"/>
                 <w:szCs w:val="20"/>
               </w:rPr>
-              <w:t xml:space="preserve">Divide &amp; </w:t>
+              <w:t>Divide &amp; Conquer</w:t>
             </w:r>
-            <w:proofErr w:type="gramStart"/>
-            <w:r>
-              <w:rPr>
-                <w:b/>
-                <w:bCs/>
-                <w:color w:val="FFFFFF"/>
-                <w:sz w:val="20"/>
-                <w:szCs w:val="20"/>
-              </w:rPr>
-              <w:t>Conquer</w:t>
-            </w:r>
-            <w:proofErr w:type="gramEnd"/>
           </w:p>
         </w:tc>
         <w:tc>
@@ -25789,21 +24757,12 @@
             <w:pPr>
               <w:jc w:val="center"/>
             </w:pPr>
-            <w:proofErr w:type="gramStart"/>
             <w:r>
               <w:rPr>
                 <w:sz w:val="22"/>
                 <w:szCs w:val="22"/>
               </w:rPr>
-              <w:t>O(</w:t>
-            </w:r>
-            <w:proofErr w:type="gramEnd"/>
-            <w:r>
-              <w:rPr>
-                <w:sz w:val="22"/>
-                <w:szCs w:val="22"/>
-              </w:rPr>
-              <w:t>n! × n)</w:t>
+              <w:t>O(n! × n)</w:t>
             </w:r>
           </w:p>
         </w:tc>
@@ -25829,21 +24788,12 @@
             <w:pPr>
               <w:jc w:val="center"/>
             </w:pPr>
-            <w:proofErr w:type="gramStart"/>
             <w:r>
               <w:rPr>
                 <w:sz w:val="22"/>
                 <w:szCs w:val="22"/>
               </w:rPr>
-              <w:t>O(</w:t>
-            </w:r>
-            <w:proofErr w:type="gramEnd"/>
-            <w:r>
-              <w:rPr>
-                <w:sz w:val="22"/>
-                <w:szCs w:val="22"/>
-              </w:rPr>
-              <w:t>n log n)</w:t>
+              <w:t>O(n log n)</w:t>
             </w:r>
           </w:p>
         </w:tc>
@@ -25869,21 +24819,12 @@
             <w:pPr>
               <w:jc w:val="center"/>
             </w:pPr>
-            <w:proofErr w:type="gramStart"/>
             <w:r>
               <w:rPr>
                 <w:sz w:val="22"/>
                 <w:szCs w:val="22"/>
               </w:rPr>
-              <w:t>O(</w:t>
-            </w:r>
-            <w:proofErr w:type="gramEnd"/>
-            <w:r>
-              <w:rPr>
-                <w:sz w:val="22"/>
-                <w:szCs w:val="22"/>
-              </w:rPr>
-              <w:t>2ⁿ × n)</w:t>
+              <w:t>O(2ⁿ × n)</w:t>
             </w:r>
           </w:p>
         </w:tc>
@@ -26551,13 +25492,8 @@
       <w:pPr>
         <w:pStyle w:val="Heading2"/>
       </w:pPr>
-      <w:proofErr w:type="gramStart"/>
-      <w:r>
-        <w:t>7.1  Greedy</w:t>
-      </w:r>
-      <w:proofErr w:type="gramEnd"/>
-      <w:r>
-        <w:t xml:space="preserve"> – Earliest Deadline First (EDF)</w:t>
+      <w:r>
+        <w:t>7.1  Greedy – Earliest Deadline First (EDF)</w:t>
       </w:r>
     </w:p>
     <w:p>
@@ -26566,28 +25502,15 @@
         <w:jc w:val="both"/>
       </w:pPr>
       <w:r>
-        <w:t xml:space="preserve">Schedule jobs in ascending order of deadline. This approach is simple and runs in </w:t>
-      </w:r>
-      <w:proofErr w:type="gramStart"/>
-      <w:r>
-        <w:t>O(</w:t>
-      </w:r>
-      <w:proofErr w:type="gramEnd"/>
-      <w:r>
-        <w:t>n log n), but it does not minimize the total weighted penalty. EDF only minimizes the number of late jobs, not the sum of penalties. It is therefore suboptimal for the general case of this problem.</w:t>
+        <w:t>Schedule jobs in ascending order of deadline. This approach is simple and runs in O(n log n), but it does not minimize the total weighted penalty. EDF only minimizes the number of late jobs, not the sum of penalties. It is therefore suboptimal for the general case of this problem.</w:t>
       </w:r>
     </w:p>
     <w:p>
       <w:pPr>
         <w:pStyle w:val="Heading2"/>
       </w:pPr>
-      <w:proofErr w:type="gramStart"/>
-      <w:r>
-        <w:t>7.2  Branch</w:t>
-      </w:r>
-      <w:proofErr w:type="gramEnd"/>
-      <w:r>
-        <w:t xml:space="preserve"> and Bound</w:t>
+      <w:r>
+        <w:t>7.2  Branch and Bound</w:t>
       </w:r>
     </w:p>
     <w:p>
@@ -26596,28 +25519,15 @@
         <w:jc w:val="both"/>
       </w:pPr>
       <w:r>
-        <w:t xml:space="preserve">Branch and </w:t>
-      </w:r>
-      <w:proofErr w:type="gramStart"/>
-      <w:r>
-        <w:t>Bound</w:t>
-      </w:r>
-      <w:proofErr w:type="gramEnd"/>
-      <w:r>
-        <w:t xml:space="preserve"> explores the scheduling search tree with pruning: if a partial schedule’s accumulated penalty already exceeds the best known solution, that branch is abandoned. This approach is optimal and generally faster than pure Brute Force in practice, but its worst-case complexity remains exponential.</w:t>
+        <w:t>Branch and Bound explores the scheduling search tree with pruning: if a partial schedule’s accumulated penalty already exceeds the best known solution, that branch is abandoned. This approach is optimal and generally faster than pure Brute Force in practice, but its worst-case complexity remains exponential.</w:t>
       </w:r>
     </w:p>
     <w:p>
       <w:pPr>
         <w:pStyle w:val="Heading2"/>
       </w:pPr>
-      <w:proofErr w:type="gramStart"/>
-      <w:r>
-        <w:t>7.3  Approximation</w:t>
-      </w:r>
-      <w:proofErr w:type="gramEnd"/>
-      <w:r>
-        <w:t xml:space="preserve"> Algorithms</w:t>
+      <w:r>
+        <w:t>7.3  Approximation Algorithms</w:t>
       </w:r>
     </w:p>
     <w:p>
@@ -26690,15 +25600,7 @@
         <w:jc w:val="both"/>
       </w:pPr>
       <w:r>
-        <w:t xml:space="preserve">The Brute Force approach is correct but computationally expensive at </w:t>
-      </w:r>
-      <w:proofErr w:type="gramStart"/>
-      <w:r>
-        <w:t>O(</w:t>
-      </w:r>
-      <w:proofErr w:type="gramEnd"/>
-      <w:r>
-        <w:t>n! × n), rendering it impractical beyond approximately 12 jobs.</w:t>
+        <w:t>The Brute Force approach is correct but computationally expensive at O(n! × n), rendering it impractical beyond approximately 12 jobs.</w:t>
       </w:r>
     </w:p>
     <w:p>
@@ -26712,15 +25614,7 @@
         <w:jc w:val="both"/>
       </w:pPr>
       <w:r>
-        <w:t xml:space="preserve">The Divide and Conquer (merge sort-based) approach runs efficiently at </w:t>
-      </w:r>
-      <w:proofErr w:type="gramStart"/>
-      <w:r>
-        <w:t>O(</w:t>
-      </w:r>
-      <w:proofErr w:type="gramEnd"/>
-      <w:r>
-        <w:t>n log n) but applies only pairwise local comparisons, which can yield suboptimal results when the cumulative scheduling context is ignored.</w:t>
+        <w:t>The Divide and Conquer (merge sort-based) approach runs efficiently at O(n log n) but applies only pairwise local comparisons, which can yield suboptimal results when the cumulative scheduling context is ignored.</w:t>
       </w:r>
     </w:p>
     <w:p>
@@ -26751,117 +25645,9 @@
         <w:t>No single polynomial-time algorithm is known to solve this problem optimally in the general case (it belongs to the NP-hard family for certain weighted variants), making the trade-off between optimality and efficiency a core design consideration.</w:t>
       </w:r>
     </w:p>
-    <w:p>
-      <w:pPr>
-        <w:spacing w:line="160" w:lineRule="auto"/>
-      </w:pPr>
-    </w:p>
-    <w:p>
-      <w:pPr>
-        <w:pBdr>
-          <w:bottom w:val="single" w:sz="6" w:space="4" w:color="2E74B5"/>
-        </w:pBdr>
-        <w:spacing w:before="200" w:after="120"/>
-      </w:pPr>
-      <w:r>
-        <w:rPr>
-          <w:b/>
-          <w:bCs/>
-          <w:color w:val="1F3864"/>
-          <w:sz w:val="26"/>
-          <w:szCs w:val="26"/>
-        </w:rPr>
-        <w:t>9.  References</w:t>
-      </w:r>
-    </w:p>
-    <w:p>
-      <w:pPr>
-        <w:pStyle w:val="ListParagraph"/>
-        <w:numPr>
-          <w:ilvl w:val="0"/>
-          <w:numId w:val="3"/>
-        </w:numPr>
-        <w:spacing w:before="60" w:after="60" w:line="276" w:lineRule="auto"/>
-        <w:jc w:val="both"/>
-      </w:pPr>
-      <w:r>
-        <w:t>Levitin, A. (2012). Introduction to The Design and Analysis of Algorithms (3rd ed.). Pearson.</w:t>
-      </w:r>
-    </w:p>
-    <w:p>
-      <w:pPr>
-        <w:pStyle w:val="ListParagraph"/>
-        <w:numPr>
-          <w:ilvl w:val="0"/>
-          <w:numId w:val="3"/>
-        </w:numPr>
-        <w:spacing w:before="60" w:after="60" w:line="276" w:lineRule="auto"/>
-        <w:jc w:val="both"/>
-      </w:pPr>
-      <w:proofErr w:type="spellStart"/>
-      <w:r>
-        <w:t>Cormen</w:t>
-      </w:r>
-      <w:proofErr w:type="spellEnd"/>
-      <w:r>
-        <w:t xml:space="preserve">, T. H., </w:t>
-      </w:r>
-      <w:proofErr w:type="spellStart"/>
-      <w:r>
-        <w:t>Leiserson</w:t>
-      </w:r>
-      <w:proofErr w:type="spellEnd"/>
-      <w:r>
-        <w:t>, C. E., Rivest, R. L., &amp; Stein, C. (2009). Introduction to Algorithms (3rd ed.). MIT Press.</w:t>
-      </w:r>
-    </w:p>
-    <w:p>
-      <w:pPr>
-        <w:pStyle w:val="ListParagraph"/>
-        <w:numPr>
-          <w:ilvl w:val="0"/>
-          <w:numId w:val="3"/>
-        </w:numPr>
-        <w:spacing w:before="60" w:after="60" w:line="276" w:lineRule="auto"/>
-        <w:jc w:val="both"/>
-      </w:pPr>
-      <w:r>
-        <w:t>Pinedo, M. L. (2016). Scheduling: Theory, Algorithms, and Systems (5th ed.). Springer.</w:t>
-      </w:r>
-    </w:p>
-    <w:p>
-      <w:pPr>
-        <w:pStyle w:val="ListParagraph"/>
-        <w:numPr>
-          <w:ilvl w:val="0"/>
-          <w:numId w:val="3"/>
-        </w:numPr>
-        <w:spacing w:before="60" w:after="60" w:line="276" w:lineRule="auto"/>
-        <w:jc w:val="both"/>
-        <w:rPr>
-          <w:u w:val="single"/>
-        </w:rPr>
-      </w:pPr>
-      <w:proofErr w:type="spellStart"/>
-      <w:r>
-        <w:t>GeeksforGeeks</w:t>
-      </w:r>
-      <w:proofErr w:type="spellEnd"/>
-      <w:r>
-        <w:t xml:space="preserve">. (2024). Job Sequencing Problem. </w:t>
-      </w:r>
-      <w:hyperlink r:id="rId14" w:history="1">
-        <w:r>
-          <w:rPr>
-            <w:rStyle w:val="Hyperlink"/>
-          </w:rPr>
-          <w:t>https://www.geeksforgeeks.org/job-sequencing-problem/</w:t>
-        </w:r>
-      </w:hyperlink>
-    </w:p>
     <w:sectPr>
-      <w:headerReference w:type="default" r:id="rId15"/>
-      <w:footerReference w:type="default" r:id="rId16"/>
+      <w:headerReference w:type="default" r:id="rId14"/>
+      <w:footerReference w:type="default" r:id="rId15"/>
       <w:pgSz w:w="11906" w:h="16838"/>
       <w:pgMar w:top="1440" w:right="1440" w:bottom="1440" w:left="1440" w:header="708" w:footer="708" w:gutter="0"/>
       <w:cols w:space="720"/>

</xml_diff>